<commit_message>
Aplicar formato Arial en blanco y negro al documento del proyecto
</commit_message>
<xml_diff>
--- a/copia/Problema_Objetivos_KPI_Vacunacion_Francia.docx
+++ b/copia/Problema_Objetivos_KPI_Vacunacion_Francia.docx
@@ -3035,7 +3035,7 @@
   <w:docDefaults>
     <w:rPrDefault>
       <w:rPr>
-        <w:rFonts w:asciiTheme="minorHAnsi" w:eastAsiaTheme="minorEastAsia" w:hAnsiTheme="minorHAnsi" w:cstheme="minorBidi"/>
+        <w:rFonts w:ascii="Arial" w:hAnsi="Arial" w:eastAsia="Arial" w:cs="Arial"/>
         <w:sz w:val="22"/>
         <w:szCs w:val="22"/>
         <w:lang w:val="en-US" w:eastAsia="en-US" w:bidi="ar-SA"/>
@@ -3194,7 +3194,7 @@
       <w:spacing w:after="140" w:line="269" w:lineRule="auto"/>
     </w:pPr>
     <w:rPr>
-      <w:rFonts w:ascii="Calibri" w:hAnsi="Calibri"/>
+      <w:rFonts w:ascii="Arial" w:hAnsi="Arial" w:eastAsia="Arial" w:cs="Arial"/>
       <w:color w:val="000000"/>
       <w:sz w:val="22"/>
     </w:rPr>
@@ -3213,6 +3213,10 @@
       </w:tabs>
       <w:spacing w:after="0" w:line="240" w:lineRule="auto"/>
     </w:pPr>
+    <w:rPr>
+      <w:rFonts w:ascii="Arial" w:hAnsi="Arial" w:eastAsia="Arial" w:cs="Arial"/>
+      <w:color w:val="000000"/>
+    </w:rPr>
   </w:style>
   <w:style w:type="character" w:customStyle="1" w:styleId="HeaderChar">
     <w:name w:val="Header Char"/>
@@ -3220,6 +3224,10 @@
     <w:link w:val="Header"/>
     <w:uiPriority w:val="99"/>
     <w:rsid w:val="00E618BF"/>
+    <w:rPr>
+      <w:rFonts w:ascii="Arial" w:hAnsi="Arial" w:eastAsia="Arial" w:cs="Arial"/>
+      <w:color w:val="000000"/>
+    </w:rPr>
   </w:style>
   <w:style w:type="paragraph" w:styleId="Footer">
     <w:name w:val="footer"/>
@@ -3235,6 +3243,10 @@
       </w:tabs>
       <w:spacing w:after="0" w:line="240" w:lineRule="auto"/>
     </w:pPr>
+    <w:rPr>
+      <w:rFonts w:ascii="Arial" w:hAnsi="Arial" w:eastAsia="Arial" w:cs="Arial"/>
+      <w:color w:val="000000"/>
+    </w:rPr>
   </w:style>
   <w:style w:type="character" w:customStyle="1" w:styleId="FooterChar">
     <w:name w:val="Footer Char"/>
@@ -3242,6 +3254,10 @@
     <w:link w:val="Footer"/>
     <w:uiPriority w:val="99"/>
     <w:rsid w:val="00E618BF"/>
+    <w:rPr>
+      <w:rFonts w:ascii="Arial" w:hAnsi="Arial" w:eastAsia="Arial" w:cs="Arial"/>
+      <w:color w:val="000000"/>
+    </w:rPr>
   </w:style>
   <w:style w:type="paragraph" w:styleId="Heading1">
     <w:name w:val="heading 1"/>
@@ -3258,7 +3274,7 @@
       <w:outlineLvl w:val="0"/>
     </w:pPr>
     <w:rPr>
-      <w:rFonts w:asciiTheme="majorHAnsi" w:eastAsiaTheme="majorEastAsia" w:hAnsiTheme="majorHAnsi" w:cstheme="majorBidi" w:ascii="Calibri" w:hAnsi="Calibri"/>
+      <w:rFonts w:ascii="Arial" w:hAnsi="Arial" w:eastAsia="Arial" w:cs="Arial"/>
       <w:b/>
       <w:bCs/>
       <w:color w:val="000000"/>
@@ -3282,7 +3298,7 @@
       <w:outlineLvl w:val="1"/>
     </w:pPr>
     <w:rPr>
-      <w:rFonts w:asciiTheme="majorHAnsi" w:eastAsiaTheme="majorEastAsia" w:hAnsiTheme="majorHAnsi" w:cstheme="majorBidi" w:ascii="Calibri" w:hAnsi="Calibri"/>
+      <w:rFonts w:ascii="Arial" w:hAnsi="Arial" w:eastAsia="Arial" w:cs="Arial"/>
       <w:b/>
       <w:bCs/>
       <w:color w:val="000000"/>
@@ -3306,10 +3322,10 @@
       <w:outlineLvl w:val="2"/>
     </w:pPr>
     <w:rPr>
-      <w:rFonts w:asciiTheme="majorHAnsi" w:eastAsiaTheme="majorEastAsia" w:hAnsiTheme="majorHAnsi" w:cstheme="majorBidi"/>
+      <w:rFonts w:ascii="Arial" w:hAnsi="Arial" w:eastAsia="Arial" w:cs="Arial"/>
       <w:b/>
       <w:bCs/>
-      <w:color w:val="4F81BD" w:themeColor="accent1"/>
+      <w:color w:val="000000"/>
     </w:rPr>
   </w:style>
   <w:style w:type="paragraph" w:styleId="Heading4">
@@ -3329,12 +3345,12 @@
       <w:outlineLvl w:val="3"/>
     </w:pPr>
     <w:rPr>
-      <w:rFonts w:asciiTheme="majorHAnsi" w:eastAsiaTheme="majorEastAsia" w:hAnsiTheme="majorHAnsi" w:cstheme="majorBidi"/>
+      <w:rFonts w:ascii="Arial" w:hAnsi="Arial" w:eastAsia="Arial" w:cs="Arial"/>
       <w:b/>
       <w:bCs/>
       <w:i/>
       <w:iCs/>
-      <w:color w:val="4F81BD" w:themeColor="accent1"/>
+      <w:color w:val="000000"/>
     </w:rPr>
   </w:style>
   <w:style w:type="paragraph" w:styleId="Heading5">
@@ -3354,8 +3370,8 @@
       <w:outlineLvl w:val="4"/>
     </w:pPr>
     <w:rPr>
-      <w:rFonts w:asciiTheme="majorHAnsi" w:eastAsiaTheme="majorEastAsia" w:hAnsiTheme="majorHAnsi" w:cstheme="majorBidi"/>
-      <w:color w:val="243F60" w:themeColor="accent1" w:themeShade="7F"/>
+      <w:rFonts w:ascii="Arial" w:hAnsi="Arial" w:eastAsia="Arial" w:cs="Arial"/>
+      <w:color w:val="000000"/>
     </w:rPr>
   </w:style>
   <w:style w:type="paragraph" w:styleId="Heading6">
@@ -3375,10 +3391,10 @@
       <w:outlineLvl w:val="5"/>
     </w:pPr>
     <w:rPr>
-      <w:rFonts w:asciiTheme="majorHAnsi" w:eastAsiaTheme="majorEastAsia" w:hAnsiTheme="majorHAnsi" w:cstheme="majorBidi"/>
+      <w:rFonts w:ascii="Arial" w:hAnsi="Arial" w:eastAsia="Arial" w:cs="Arial"/>
       <w:i/>
       <w:iCs/>
-      <w:color w:val="243F60" w:themeColor="accent1" w:themeShade="7F"/>
+      <w:color w:val="000000"/>
     </w:rPr>
   </w:style>
   <w:style w:type="paragraph" w:styleId="Heading7">
@@ -3398,10 +3414,10 @@
       <w:outlineLvl w:val="6"/>
     </w:pPr>
     <w:rPr>
-      <w:rFonts w:asciiTheme="majorHAnsi" w:eastAsiaTheme="majorEastAsia" w:hAnsiTheme="majorHAnsi" w:cstheme="majorBidi"/>
+      <w:rFonts w:ascii="Arial" w:hAnsi="Arial" w:eastAsia="Arial" w:cs="Arial"/>
       <w:i/>
       <w:iCs/>
-      <w:color w:val="404040" w:themeColor="text1" w:themeTint="BF"/>
+      <w:color w:val="000000"/>
     </w:rPr>
   </w:style>
   <w:style w:type="paragraph" w:styleId="Heading8">
@@ -3421,8 +3437,8 @@
       <w:outlineLvl w:val="7"/>
     </w:pPr>
     <w:rPr>
-      <w:rFonts w:asciiTheme="majorHAnsi" w:eastAsiaTheme="majorEastAsia" w:hAnsiTheme="majorHAnsi" w:cstheme="majorBidi"/>
-      <w:color w:val="4F81BD" w:themeColor="accent1"/>
+      <w:rFonts w:ascii="Arial" w:hAnsi="Arial" w:eastAsia="Arial" w:cs="Arial"/>
+      <w:color w:val="000000"/>
       <w:sz w:val="20"/>
       <w:szCs w:val="20"/>
     </w:rPr>
@@ -3444,10 +3460,10 @@
       <w:outlineLvl w:val="8"/>
     </w:pPr>
     <w:rPr>
-      <w:rFonts w:asciiTheme="majorHAnsi" w:eastAsiaTheme="majorEastAsia" w:hAnsiTheme="majorHAnsi" w:cstheme="majorBidi"/>
+      <w:rFonts w:ascii="Arial" w:hAnsi="Arial" w:eastAsia="Arial" w:cs="Arial"/>
       <w:i/>
       <w:iCs/>
-      <w:color w:val="404040" w:themeColor="text1" w:themeTint="BF"/>
+      <w:color w:val="000000"/>
       <w:sz w:val="20"/>
       <w:szCs w:val="20"/>
     </w:rPr>
@@ -3457,6 +3473,10 @@
     <w:uiPriority w:val="1"/>
     <w:semiHidden/>
     <w:unhideWhenUsed/>
+    <w:rPr>
+      <w:rFonts w:ascii="Arial" w:hAnsi="Arial" w:eastAsia="Arial" w:cs="Arial"/>
+      <w:color w:val="000000"/>
+    </w:rPr>
   </w:style>
   <w:style w:type="table" w:default="1" w:styleId="TableNormal">
     <w:name w:val="Normal Table"/>
@@ -3487,6 +3507,10 @@
     <w:pPr>
       <w:spacing w:after="0" w:line="240" w:lineRule="auto"/>
     </w:pPr>
+    <w:rPr>
+      <w:rFonts w:ascii="Arial" w:hAnsi="Arial" w:eastAsia="Arial" w:cs="Arial"/>
+      <w:color w:val="000000"/>
+    </w:rPr>
   </w:style>
   <w:style w:type="character" w:customStyle="1" w:styleId="Heading1Char">
     <w:name w:val="Heading 1 Char"/>
@@ -3495,10 +3519,10 @@
     <w:uiPriority w:val="9"/>
     <w:rsid w:val="00FC693F"/>
     <w:rPr>
-      <w:rFonts w:asciiTheme="majorHAnsi" w:eastAsiaTheme="majorEastAsia" w:hAnsiTheme="majorHAnsi" w:cstheme="majorBidi"/>
+      <w:rFonts w:ascii="Arial" w:hAnsi="Arial" w:eastAsia="Arial" w:cs="Arial"/>
       <w:b/>
       <w:bCs/>
-      <w:color w:val="365F91" w:themeColor="accent1" w:themeShade="BF"/>
+      <w:color w:val="000000"/>
       <w:sz w:val="28"/>
       <w:szCs w:val="28"/>
     </w:rPr>
@@ -3510,10 +3534,10 @@
     <w:uiPriority w:val="9"/>
     <w:rsid w:val="00FC693F"/>
     <w:rPr>
-      <w:rFonts w:asciiTheme="majorHAnsi" w:eastAsiaTheme="majorEastAsia" w:hAnsiTheme="majorHAnsi" w:cstheme="majorBidi"/>
+      <w:rFonts w:ascii="Arial" w:hAnsi="Arial" w:eastAsia="Arial" w:cs="Arial"/>
       <w:b/>
       <w:bCs/>
-      <w:color w:val="4F81BD" w:themeColor="accent1"/>
+      <w:color w:val="000000"/>
       <w:sz w:val="26"/>
       <w:szCs w:val="26"/>
     </w:rPr>
@@ -3525,10 +3549,10 @@
     <w:uiPriority w:val="9"/>
     <w:rsid w:val="00FC693F"/>
     <w:rPr>
-      <w:rFonts w:asciiTheme="majorHAnsi" w:eastAsiaTheme="majorEastAsia" w:hAnsiTheme="majorHAnsi" w:cstheme="majorBidi"/>
+      <w:rFonts w:ascii="Arial" w:hAnsi="Arial" w:eastAsia="Arial" w:cs="Arial"/>
       <w:b/>
       <w:bCs/>
-      <w:color w:val="4F81BD" w:themeColor="accent1"/>
+      <w:color w:val="000000"/>
     </w:rPr>
   </w:style>
   <w:style w:type="paragraph" w:styleId="Title">
@@ -3544,7 +3568,7 @@
       <w:contextualSpacing/>
     </w:pPr>
     <w:rPr>
-      <w:rFonts w:asciiTheme="majorHAnsi" w:eastAsiaTheme="majorEastAsia" w:hAnsiTheme="majorHAnsi" w:cstheme="majorBidi" w:ascii="Calibri" w:hAnsi="Calibri"/>
+      <w:rFonts w:ascii="Arial" w:hAnsi="Arial" w:eastAsia="Arial" w:cs="Arial"/>
       <w:color w:val="000000"/>
       <w:spacing w:val="5"/>
       <w:kern w:val="28"/>
@@ -3559,8 +3583,8 @@
     <w:uiPriority w:val="10"/>
     <w:rsid w:val="00FC693F"/>
     <w:rPr>
-      <w:rFonts w:asciiTheme="majorHAnsi" w:eastAsiaTheme="majorEastAsia" w:hAnsiTheme="majorHAnsi" w:cstheme="majorBidi"/>
-      <w:color w:val="17365D" w:themeColor="text2" w:themeShade="BF"/>
+      <w:rFonts w:ascii="Arial" w:hAnsi="Arial" w:eastAsia="Arial" w:cs="Arial"/>
+      <w:color w:val="000000"/>
       <w:spacing w:val="5"/>
       <w:kern w:val="28"/>
       <w:sz w:val="52"/>
@@ -3582,7 +3606,7 @@
       <w:spacing w:after="140"/>
     </w:pPr>
     <w:rPr>
-      <w:rFonts w:asciiTheme="majorHAnsi" w:eastAsiaTheme="majorEastAsia" w:hAnsiTheme="majorHAnsi" w:cstheme="majorBidi" w:ascii="Calibri" w:hAnsi="Calibri"/>
+      <w:rFonts w:ascii="Arial" w:hAnsi="Arial" w:eastAsia="Arial" w:cs="Arial"/>
       <w:i/>
       <w:iCs/>
       <w:color w:val="000000"/>
@@ -3598,10 +3622,10 @@
     <w:uiPriority w:val="11"/>
     <w:rsid w:val="00FC693F"/>
     <w:rPr>
-      <w:rFonts w:asciiTheme="majorHAnsi" w:eastAsiaTheme="majorEastAsia" w:hAnsiTheme="majorHAnsi" w:cstheme="majorBidi"/>
+      <w:rFonts w:ascii="Arial" w:hAnsi="Arial" w:eastAsia="Arial" w:cs="Arial"/>
       <w:i/>
       <w:iCs/>
-      <w:color w:val="4F81BD" w:themeColor="accent1"/>
+      <w:color w:val="000000"/>
       <w:spacing w:val="15"/>
       <w:sz w:val="24"/>
       <w:szCs w:val="24"/>
@@ -3617,6 +3641,10 @@
       <w:ind w:left="720"/>
       <w:contextualSpacing/>
     </w:pPr>
+    <w:rPr>
+      <w:rFonts w:ascii="Arial" w:hAnsi="Arial" w:eastAsia="Arial" w:cs="Arial"/>
+      <w:color w:val="000000"/>
+    </w:rPr>
   </w:style>
   <w:style w:type="paragraph" w:styleId="BodyText">
     <w:name w:val="Body Text"/>
@@ -3628,6 +3656,10 @@
     <w:pPr>
       <w:spacing w:after="120"/>
     </w:pPr>
+    <w:rPr>
+      <w:rFonts w:ascii="Arial" w:hAnsi="Arial" w:eastAsia="Arial" w:cs="Arial"/>
+      <w:color w:val="000000"/>
+    </w:rPr>
   </w:style>
   <w:style w:type="character" w:customStyle="1" w:styleId="BodyTextChar">
     <w:name w:val="Body Text Char"/>
@@ -3635,6 +3667,10 @@
     <w:link w:val="BodyText"/>
     <w:uiPriority w:val="99"/>
     <w:rsid w:val="00AA1D8D"/>
+    <w:rPr>
+      <w:rFonts w:ascii="Arial" w:hAnsi="Arial" w:eastAsia="Arial" w:cs="Arial"/>
+      <w:color w:val="000000"/>
+    </w:rPr>
   </w:style>
   <w:style w:type="paragraph" w:styleId="BodyText2">
     <w:name w:val="Body Text 2"/>
@@ -3646,6 +3682,10 @@
     <w:pPr>
       <w:spacing w:after="120" w:line="480" w:lineRule="auto"/>
     </w:pPr>
+    <w:rPr>
+      <w:rFonts w:ascii="Arial" w:hAnsi="Arial" w:eastAsia="Arial" w:cs="Arial"/>
+      <w:color w:val="000000"/>
+    </w:rPr>
   </w:style>
   <w:style w:type="character" w:customStyle="1" w:styleId="BodyText2Char">
     <w:name w:val="Body Text 2 Char"/>
@@ -3653,6 +3693,10 @@
     <w:link w:val="BodyText2"/>
     <w:uiPriority w:val="99"/>
     <w:rsid w:val="00AA1D8D"/>
+    <w:rPr>
+      <w:rFonts w:ascii="Arial" w:hAnsi="Arial" w:eastAsia="Arial" w:cs="Arial"/>
+      <w:color w:val="000000"/>
+    </w:rPr>
   </w:style>
   <w:style w:type="paragraph" w:styleId="BodyText3">
     <w:name w:val="Body Text 3"/>
@@ -3665,6 +3709,8 @@
       <w:spacing w:after="120"/>
     </w:pPr>
     <w:rPr>
+      <w:rFonts w:ascii="Arial" w:hAnsi="Arial" w:eastAsia="Arial" w:cs="Arial"/>
+      <w:color w:val="000000"/>
       <w:sz w:val="16"/>
       <w:szCs w:val="16"/>
     </w:rPr>
@@ -3676,6 +3722,8 @@
     <w:uiPriority w:val="99"/>
     <w:rsid w:val="00AA1D8D"/>
     <w:rPr>
+      <w:rFonts w:ascii="Arial" w:hAnsi="Arial" w:eastAsia="Arial" w:cs="Arial"/>
+      <w:color w:val="000000"/>
       <w:sz w:val="16"/>
       <w:szCs w:val="16"/>
     </w:rPr>
@@ -3690,6 +3738,10 @@
       <w:ind w:left="360" w:hanging="360"/>
       <w:contextualSpacing/>
     </w:pPr>
+    <w:rPr>
+      <w:rFonts w:ascii="Arial" w:hAnsi="Arial" w:eastAsia="Arial" w:cs="Arial"/>
+      <w:color w:val="000000"/>
+    </w:rPr>
   </w:style>
   <w:style w:type="paragraph" w:styleId="List2">
     <w:name w:val="List 2"/>
@@ -3701,6 +3753,10 @@
       <w:ind w:left="720" w:hanging="360"/>
       <w:contextualSpacing/>
     </w:pPr>
+    <w:rPr>
+      <w:rFonts w:ascii="Arial" w:hAnsi="Arial" w:eastAsia="Arial" w:cs="Arial"/>
+      <w:color w:val="000000"/>
+    </w:rPr>
   </w:style>
   <w:style w:type="paragraph" w:styleId="List3">
     <w:name w:val="List 3"/>
@@ -3712,6 +3768,10 @@
       <w:ind w:left="1080" w:hanging="360"/>
       <w:contextualSpacing/>
     </w:pPr>
+    <w:rPr>
+      <w:rFonts w:ascii="Arial" w:hAnsi="Arial" w:eastAsia="Arial" w:cs="Arial"/>
+      <w:color w:val="000000"/>
+    </w:rPr>
   </w:style>
   <w:style w:type="paragraph" w:styleId="ListBullet">
     <w:name w:val="List Bullet"/>
@@ -3725,6 +3785,10 @@
       </w:numPr>
       <w:contextualSpacing/>
     </w:pPr>
+    <w:rPr>
+      <w:rFonts w:ascii="Arial" w:hAnsi="Arial" w:eastAsia="Arial" w:cs="Arial"/>
+      <w:color w:val="000000"/>
+    </w:rPr>
   </w:style>
   <w:style w:type="paragraph" w:styleId="ListBullet2">
     <w:name w:val="List Bullet 2"/>
@@ -3738,6 +3802,10 @@
       </w:numPr>
       <w:contextualSpacing/>
     </w:pPr>
+    <w:rPr>
+      <w:rFonts w:ascii="Arial" w:hAnsi="Arial" w:eastAsia="Arial" w:cs="Arial"/>
+      <w:color w:val="000000"/>
+    </w:rPr>
   </w:style>
   <w:style w:type="paragraph" w:styleId="ListBullet3">
     <w:name w:val="List Bullet 3"/>
@@ -3751,6 +3819,10 @@
       </w:numPr>
       <w:contextualSpacing/>
     </w:pPr>
+    <w:rPr>
+      <w:rFonts w:ascii="Arial" w:hAnsi="Arial" w:eastAsia="Arial" w:cs="Arial"/>
+      <w:color w:val="000000"/>
+    </w:rPr>
   </w:style>
   <w:style w:type="paragraph" w:styleId="ListNumber">
     <w:name w:val="List Number"/>
@@ -3764,6 +3836,10 @@
       </w:numPr>
       <w:contextualSpacing/>
     </w:pPr>
+    <w:rPr>
+      <w:rFonts w:ascii="Arial" w:hAnsi="Arial" w:eastAsia="Arial" w:cs="Arial"/>
+      <w:color w:val="000000"/>
+    </w:rPr>
   </w:style>
   <w:style w:type="paragraph" w:styleId="ListNumber2">
     <w:name w:val="List Number 2"/>
@@ -3777,6 +3853,10 @@
       </w:numPr>
       <w:contextualSpacing/>
     </w:pPr>
+    <w:rPr>
+      <w:rFonts w:ascii="Arial" w:hAnsi="Arial" w:eastAsia="Arial" w:cs="Arial"/>
+      <w:color w:val="000000"/>
+    </w:rPr>
   </w:style>
   <w:style w:type="paragraph" w:styleId="ListNumber3">
     <w:name w:val="List Number 3"/>
@@ -3790,6 +3870,10 @@
       </w:numPr>
       <w:contextualSpacing/>
     </w:pPr>
+    <w:rPr>
+      <w:rFonts w:ascii="Arial" w:hAnsi="Arial" w:eastAsia="Arial" w:cs="Arial"/>
+      <w:color w:val="000000"/>
+    </w:rPr>
   </w:style>
   <w:style w:type="paragraph" w:styleId="ListContinue">
     <w:name w:val="List Continue"/>
@@ -3802,6 +3886,10 @@
       <w:ind w:left="360"/>
       <w:contextualSpacing/>
     </w:pPr>
+    <w:rPr>
+      <w:rFonts w:ascii="Arial" w:hAnsi="Arial" w:eastAsia="Arial" w:cs="Arial"/>
+      <w:color w:val="000000"/>
+    </w:rPr>
   </w:style>
   <w:style w:type="paragraph" w:styleId="ListContinue2">
     <w:name w:val="List Continue 2"/>
@@ -3814,6 +3902,10 @@
       <w:ind w:left="720"/>
       <w:contextualSpacing/>
     </w:pPr>
+    <w:rPr>
+      <w:rFonts w:ascii="Arial" w:hAnsi="Arial" w:eastAsia="Arial" w:cs="Arial"/>
+      <w:color w:val="000000"/>
+    </w:rPr>
   </w:style>
   <w:style w:type="paragraph" w:styleId="ListContinue3">
     <w:name w:val="List Continue 3"/>
@@ -3826,6 +3918,10 @@
       <w:ind w:left="1080"/>
       <w:contextualSpacing/>
     </w:pPr>
+    <w:rPr>
+      <w:rFonts w:ascii="Arial" w:hAnsi="Arial" w:eastAsia="Arial" w:cs="Arial"/>
+      <w:color w:val="000000"/>
+    </w:rPr>
   </w:style>
   <w:style w:type="paragraph" w:styleId="MacroText">
     <w:name w:val="macro"/>
@@ -3845,7 +3941,8 @@
       </w:tabs>
     </w:pPr>
     <w:rPr>
-      <w:rFonts w:ascii="Courier" w:hAnsi="Courier"/>
+      <w:rFonts w:ascii="Arial" w:hAnsi="Arial" w:eastAsia="Arial" w:cs="Arial"/>
+      <w:color w:val="000000"/>
       <w:sz w:val="20"/>
       <w:szCs w:val="20"/>
     </w:rPr>
@@ -3857,7 +3954,8 @@
     <w:uiPriority w:val="99"/>
     <w:rsid w:val="0029639D"/>
     <w:rPr>
-      <w:rFonts w:ascii="Courier" w:hAnsi="Courier"/>
+      <w:rFonts w:ascii="Arial" w:hAnsi="Arial" w:eastAsia="Arial" w:cs="Arial"/>
+      <w:color w:val="000000"/>
       <w:sz w:val="20"/>
       <w:szCs w:val="20"/>
     </w:rPr>
@@ -3871,9 +3969,10 @@
     <w:qFormat/>
     <w:rsid w:val="00FC693F"/>
     <w:rPr>
+      <w:rFonts w:ascii="Arial" w:hAnsi="Arial" w:eastAsia="Arial" w:cs="Arial"/>
       <w:i/>
       <w:iCs/>
-      <w:color w:val="000000" w:themeColor="text1"/>
+      <w:color w:val="000000"/>
     </w:rPr>
   </w:style>
   <w:style w:type="character" w:customStyle="1" w:styleId="QuoteChar">
@@ -3883,9 +3982,10 @@
     <w:uiPriority w:val="29"/>
     <w:rsid w:val="00FC693F"/>
     <w:rPr>
+      <w:rFonts w:ascii="Arial" w:hAnsi="Arial" w:eastAsia="Arial" w:cs="Arial"/>
       <w:i/>
       <w:iCs/>
-      <w:color w:val="000000" w:themeColor="text1"/>
+      <w:color w:val="000000"/>
     </w:rPr>
   </w:style>
   <w:style w:type="character" w:customStyle="1" w:styleId="Heading4Char">
@@ -3896,12 +3996,12 @@
     <w:semiHidden/>
     <w:rsid w:val="00FC693F"/>
     <w:rPr>
-      <w:rFonts w:asciiTheme="majorHAnsi" w:eastAsiaTheme="majorEastAsia" w:hAnsiTheme="majorHAnsi" w:cstheme="majorBidi"/>
+      <w:rFonts w:ascii="Arial" w:hAnsi="Arial" w:eastAsia="Arial" w:cs="Arial"/>
       <w:b/>
       <w:bCs/>
       <w:i/>
       <w:iCs/>
-      <w:color w:val="4F81BD" w:themeColor="accent1"/>
+      <w:color w:val="000000"/>
     </w:rPr>
   </w:style>
   <w:style w:type="character" w:customStyle="1" w:styleId="Heading5Char">
@@ -3912,8 +4012,8 @@
     <w:semiHidden/>
     <w:rsid w:val="00FC693F"/>
     <w:rPr>
-      <w:rFonts w:asciiTheme="majorHAnsi" w:eastAsiaTheme="majorEastAsia" w:hAnsiTheme="majorHAnsi" w:cstheme="majorBidi"/>
-      <w:color w:val="243F60" w:themeColor="accent1" w:themeShade="7F"/>
+      <w:rFonts w:ascii="Arial" w:hAnsi="Arial" w:eastAsia="Arial" w:cs="Arial"/>
+      <w:color w:val="000000"/>
     </w:rPr>
   </w:style>
   <w:style w:type="character" w:customStyle="1" w:styleId="Heading6Char">
@@ -3924,10 +4024,10 @@
     <w:semiHidden/>
     <w:rsid w:val="00FC693F"/>
     <w:rPr>
-      <w:rFonts w:asciiTheme="majorHAnsi" w:eastAsiaTheme="majorEastAsia" w:hAnsiTheme="majorHAnsi" w:cstheme="majorBidi"/>
+      <w:rFonts w:ascii="Arial" w:hAnsi="Arial" w:eastAsia="Arial" w:cs="Arial"/>
       <w:i/>
       <w:iCs/>
-      <w:color w:val="243F60" w:themeColor="accent1" w:themeShade="7F"/>
+      <w:color w:val="000000"/>
     </w:rPr>
   </w:style>
   <w:style w:type="character" w:customStyle="1" w:styleId="Heading7Char">
@@ -3938,10 +4038,10 @@
     <w:semiHidden/>
     <w:rsid w:val="00FC693F"/>
     <w:rPr>
-      <w:rFonts w:asciiTheme="majorHAnsi" w:eastAsiaTheme="majorEastAsia" w:hAnsiTheme="majorHAnsi" w:cstheme="majorBidi"/>
+      <w:rFonts w:ascii="Arial" w:hAnsi="Arial" w:eastAsia="Arial" w:cs="Arial"/>
       <w:i/>
       <w:iCs/>
-      <w:color w:val="404040" w:themeColor="text1" w:themeTint="BF"/>
+      <w:color w:val="000000"/>
     </w:rPr>
   </w:style>
   <w:style w:type="character" w:customStyle="1" w:styleId="Heading8Char">
@@ -3952,8 +4052,8 @@
     <w:semiHidden/>
     <w:rsid w:val="00FC693F"/>
     <w:rPr>
-      <w:rFonts w:asciiTheme="majorHAnsi" w:eastAsiaTheme="majorEastAsia" w:hAnsiTheme="majorHAnsi" w:cstheme="majorBidi"/>
-      <w:color w:val="4F81BD" w:themeColor="accent1"/>
+      <w:rFonts w:ascii="Arial" w:hAnsi="Arial" w:eastAsia="Arial" w:cs="Arial"/>
+      <w:color w:val="000000"/>
       <w:sz w:val="20"/>
       <w:szCs w:val="20"/>
     </w:rPr>
@@ -3966,10 +4066,10 @@
     <w:semiHidden/>
     <w:rsid w:val="00FC693F"/>
     <w:rPr>
-      <w:rFonts w:asciiTheme="majorHAnsi" w:eastAsiaTheme="majorEastAsia" w:hAnsiTheme="majorHAnsi" w:cstheme="majorBidi"/>
+      <w:rFonts w:ascii="Arial" w:hAnsi="Arial" w:eastAsia="Arial" w:cs="Arial"/>
       <w:i/>
       <w:iCs/>
-      <w:color w:val="404040" w:themeColor="text1" w:themeTint="BF"/>
+      <w:color w:val="000000"/>
       <w:sz w:val="20"/>
       <w:szCs w:val="20"/>
     </w:rPr>
@@ -3987,9 +4087,10 @@
       <w:spacing w:line="240" w:lineRule="auto"/>
     </w:pPr>
     <w:rPr>
+      <w:rFonts w:ascii="Arial" w:hAnsi="Arial" w:eastAsia="Arial" w:cs="Arial"/>
       <w:b/>
       <w:bCs/>
-      <w:color w:val="4F81BD" w:themeColor="accent1"/>
+      <w:color w:val="000000"/>
       <w:sz w:val="18"/>
       <w:szCs w:val="18"/>
     </w:rPr>
@@ -4001,8 +4102,10 @@
     <w:qFormat/>
     <w:rsid w:val="00FC693F"/>
     <w:rPr>
+      <w:rFonts w:ascii="Arial" w:hAnsi="Arial" w:eastAsia="Arial" w:cs="Arial"/>
       <w:b/>
       <w:bCs/>
+      <w:color w:val="000000"/>
     </w:rPr>
   </w:style>
   <w:style w:type="character" w:styleId="Emphasis">
@@ -4012,8 +4115,10 @@
     <w:qFormat/>
     <w:rsid w:val="00FC693F"/>
     <w:rPr>
+      <w:rFonts w:ascii="Arial" w:hAnsi="Arial" w:eastAsia="Arial" w:cs="Arial"/>
       <w:i/>
       <w:iCs/>
+      <w:color w:val="000000"/>
     </w:rPr>
   </w:style>
   <w:style w:type="paragraph" w:styleId="IntenseQuote">
@@ -4029,11 +4134,12 @@
       <w:ind w:left="936" w:right="936"/>
     </w:pPr>
     <w:rPr>
+      <w:rFonts w:ascii="Arial" w:hAnsi="Arial" w:eastAsia="Arial" w:cs="Arial"/>
       <w:b/>
       <w:bCs/>
       <w:i/>
       <w:iCs/>
-      <w:color w:val="4F81BD" w:themeColor="accent1"/>
+      <w:color w:val="000000"/>
     </w:rPr>
   </w:style>
   <w:style w:type="character" w:customStyle="1" w:styleId="IntenseQuoteChar">
@@ -4043,11 +4149,12 @@
     <w:uiPriority w:val="30"/>
     <w:rsid w:val="00FC693F"/>
     <w:rPr>
+      <w:rFonts w:ascii="Arial" w:hAnsi="Arial" w:eastAsia="Arial" w:cs="Arial"/>
       <w:b/>
       <w:bCs/>
       <w:i/>
       <w:iCs/>
-      <w:color w:val="4F81BD" w:themeColor="accent1"/>
+      <w:color w:val="000000"/>
     </w:rPr>
   </w:style>
   <w:style w:type="character" w:styleId="SubtleEmphasis">
@@ -4057,9 +4164,10 @@
     <w:qFormat/>
     <w:rsid w:val="00FC693F"/>
     <w:rPr>
+      <w:rFonts w:ascii="Arial" w:hAnsi="Arial" w:eastAsia="Arial" w:cs="Arial"/>
       <w:i/>
       <w:iCs/>
-      <w:color w:val="808080" w:themeColor="text1" w:themeTint="7F"/>
+      <w:color w:val="000000"/>
     </w:rPr>
   </w:style>
   <w:style w:type="character" w:styleId="IntenseEmphasis">
@@ -4069,11 +4177,12 @@
     <w:qFormat/>
     <w:rsid w:val="00FC693F"/>
     <w:rPr>
+      <w:rFonts w:ascii="Arial" w:hAnsi="Arial" w:eastAsia="Arial" w:cs="Arial"/>
       <w:b/>
       <w:bCs/>
       <w:i/>
       <w:iCs/>
-      <w:color w:val="4F81BD" w:themeColor="accent1"/>
+      <w:color w:val="000000"/>
     </w:rPr>
   </w:style>
   <w:style w:type="character" w:styleId="SubtleReference">
@@ -4083,8 +4192,9 @@
     <w:qFormat/>
     <w:rsid w:val="00FC693F"/>
     <w:rPr>
+      <w:rFonts w:ascii="Arial" w:hAnsi="Arial" w:eastAsia="Arial" w:cs="Arial"/>
       <w:smallCaps/>
-      <w:color w:val="C0504D" w:themeColor="accent2"/>
+      <w:color w:val="000000"/>
       <w:u w:val="single"/>
     </w:rPr>
   </w:style>
@@ -4095,10 +4205,11 @@
     <w:qFormat/>
     <w:rsid w:val="00FC693F"/>
     <w:rPr>
+      <w:rFonts w:ascii="Arial" w:hAnsi="Arial" w:eastAsia="Arial" w:cs="Arial"/>
       <w:b/>
       <w:bCs/>
       <w:smallCaps/>
-      <w:color w:val="C0504D" w:themeColor="accent2"/>
+      <w:color w:val="000000"/>
       <w:spacing w:val="5"/>
       <w:u w:val="single"/>
     </w:rPr>
@@ -4110,9 +4221,11 @@
     <w:qFormat/>
     <w:rsid w:val="00FC693F"/>
     <w:rPr>
+      <w:rFonts w:ascii="Arial" w:hAnsi="Arial" w:eastAsia="Arial" w:cs="Arial"/>
       <w:b/>
       <w:bCs/>
       <w:smallCaps/>
+      <w:color w:val="000000"/>
       <w:spacing w:val="5"/>
     </w:rPr>
   </w:style>
@@ -4128,6 +4241,10 @@
     <w:pPr>
       <w:outlineLvl w:val="9"/>
     </w:pPr>
+    <w:rPr>
+      <w:rFonts w:ascii="Arial" w:hAnsi="Arial" w:eastAsia="Arial" w:cs="Arial"/>
+      <w:color w:val="000000"/>
+    </w:rPr>
   </w:style>
   <w:style w:type="table" w:styleId="TableGrid">
     <w:name w:val="Table Grid"/>
@@ -4164,7 +4281,7 @@
       <w:spacing w:after="0" w:line="240" w:lineRule="auto"/>
     </w:pPr>
     <w:rPr>
-      <w:color w:val="000000" w:themeColor="text1" w:themeShade="BF"/>
+      <w:color w:val="000000"/>
     </w:rPr>
     <w:tblPr>
       <w:tblStyleRowBandSize w:val="1"/>
@@ -4267,7 +4384,7 @@
       <w:spacing w:after="0" w:line="240" w:lineRule="auto"/>
     </w:pPr>
     <w:rPr>
-      <w:color w:val="365F91" w:themeColor="accent1" w:themeShade="BF"/>
+      <w:color w:val="000000"/>
     </w:rPr>
     <w:tblPr>
       <w:tblStyleRowBandSize w:val="1"/>
@@ -4370,7 +4487,7 @@
       <w:spacing w:after="0" w:line="240" w:lineRule="auto"/>
     </w:pPr>
     <w:rPr>
-      <w:color w:val="943634" w:themeColor="accent2" w:themeShade="BF"/>
+      <w:color w:val="000000"/>
     </w:rPr>
     <w:tblPr>
       <w:tblStyleRowBandSize w:val="1"/>
@@ -4473,7 +4590,7 @@
       <w:spacing w:after="0" w:line="240" w:lineRule="auto"/>
     </w:pPr>
     <w:rPr>
-      <w:color w:val="76923C" w:themeColor="accent3" w:themeShade="BF"/>
+      <w:color w:val="000000"/>
     </w:rPr>
     <w:tblPr>
       <w:tblStyleRowBandSize w:val="1"/>
@@ -4576,7 +4693,7 @@
       <w:spacing w:after="0" w:line="240" w:lineRule="auto"/>
     </w:pPr>
     <w:rPr>
-      <w:color w:val="5F497A" w:themeColor="accent4" w:themeShade="BF"/>
+      <w:color w:val="000000"/>
     </w:rPr>
     <w:tblPr>
       <w:tblStyleRowBandSize w:val="1"/>
@@ -4679,7 +4796,7 @@
       <w:spacing w:after="0" w:line="240" w:lineRule="auto"/>
     </w:pPr>
     <w:rPr>
-      <w:color w:val="31849B" w:themeColor="accent5" w:themeShade="BF"/>
+      <w:color w:val="000000"/>
     </w:rPr>
     <w:tblPr>
       <w:tblStyleRowBandSize w:val="1"/>
@@ -4782,7 +4899,7 @@
       <w:spacing w:after="0" w:line="240" w:lineRule="auto"/>
     </w:pPr>
     <w:rPr>
-      <w:color w:val="E36C0A" w:themeColor="accent6" w:themeShade="BF"/>
+      <w:color w:val="000000"/>
     </w:rPr>
     <w:tblPr>
       <w:tblStyleRowBandSize w:val="1"/>
@@ -4908,7 +5025,7 @@
       <w:rPr>
         <w:b/>
         <w:bCs/>
-        <w:color w:val="FFFFFF" w:themeColor="background1"/>
+        <w:color w:val="000000"/>
       </w:rPr>
       <w:tblPr/>
       <w:tcPr>
@@ -5000,7 +5117,7 @@
       <w:rPr>
         <w:b/>
         <w:bCs/>
-        <w:color w:val="FFFFFF" w:themeColor="background1"/>
+        <w:color w:val="000000"/>
       </w:rPr>
       <w:tblPr/>
       <w:tcPr>
@@ -5092,7 +5209,7 @@
       <w:rPr>
         <w:b/>
         <w:bCs/>
-        <w:color w:val="FFFFFF" w:themeColor="background1"/>
+        <w:color w:val="000000"/>
       </w:rPr>
       <w:tblPr/>
       <w:tcPr>
@@ -5184,7 +5301,7 @@
       <w:rPr>
         <w:b/>
         <w:bCs/>
-        <w:color w:val="FFFFFF" w:themeColor="background1"/>
+        <w:color w:val="000000"/>
       </w:rPr>
       <w:tblPr/>
       <w:tcPr>
@@ -5276,7 +5393,7 @@
       <w:rPr>
         <w:b/>
         <w:bCs/>
-        <w:color w:val="FFFFFF" w:themeColor="background1"/>
+        <w:color w:val="000000"/>
       </w:rPr>
       <w:tblPr/>
       <w:tcPr>
@@ -5368,7 +5485,7 @@
       <w:rPr>
         <w:b/>
         <w:bCs/>
-        <w:color w:val="FFFFFF" w:themeColor="background1"/>
+        <w:color w:val="000000"/>
       </w:rPr>
       <w:tblPr/>
       <w:tcPr>
@@ -5460,7 +5577,7 @@
       <w:rPr>
         <w:b/>
         <w:bCs/>
-        <w:color w:val="FFFFFF" w:themeColor="background1"/>
+        <w:color w:val="000000"/>
       </w:rPr>
       <w:tblPr/>
       <w:tcPr>
@@ -5552,7 +5669,7 @@
         <w:spacing w:before="0" w:after="0" w:line="240" w:lineRule="auto"/>
       </w:pPr>
       <w:rPr>
-        <w:rFonts w:asciiTheme="majorHAnsi" w:eastAsiaTheme="majorEastAsia" w:hAnsiTheme="majorHAnsi" w:cstheme="majorBidi"/>
+        <w:rFonts w:ascii="Arial" w:hAnsi="Arial" w:eastAsia="Arial" w:cs="Arial"/>
         <w:b/>
         <w:bCs/>
       </w:rPr>
@@ -5573,7 +5690,7 @@
         <w:spacing w:before="0" w:after="0" w:line="240" w:lineRule="auto"/>
       </w:pPr>
       <w:rPr>
-        <w:rFonts w:asciiTheme="majorHAnsi" w:eastAsiaTheme="majorEastAsia" w:hAnsiTheme="majorHAnsi" w:cstheme="majorBidi"/>
+        <w:rFonts w:ascii="Arial" w:hAnsi="Arial" w:eastAsia="Arial" w:cs="Arial"/>
         <w:b/>
         <w:bCs/>
       </w:rPr>
@@ -5591,14 +5708,14 @@
     </w:tblStylePr>
     <w:tblStylePr w:type="firstCol">
       <w:rPr>
-        <w:rFonts w:asciiTheme="majorHAnsi" w:eastAsiaTheme="majorEastAsia" w:hAnsiTheme="majorHAnsi" w:cstheme="majorBidi"/>
+        <w:rFonts w:ascii="Arial" w:hAnsi="Arial" w:eastAsia="Arial" w:cs="Arial"/>
         <w:b/>
         <w:bCs/>
       </w:rPr>
     </w:tblStylePr>
     <w:tblStylePr w:type="lastCol">
       <w:rPr>
-        <w:rFonts w:asciiTheme="majorHAnsi" w:eastAsiaTheme="majorEastAsia" w:hAnsiTheme="majorHAnsi" w:cstheme="majorBidi"/>
+        <w:rFonts w:ascii="Arial" w:hAnsi="Arial" w:eastAsia="Arial" w:cs="Arial"/>
         <w:b/>
         <w:bCs/>
       </w:rPr>
@@ -5682,7 +5799,7 @@
         <w:spacing w:before="0" w:after="0" w:line="240" w:lineRule="auto"/>
       </w:pPr>
       <w:rPr>
-        <w:rFonts w:asciiTheme="majorHAnsi" w:eastAsiaTheme="majorEastAsia" w:hAnsiTheme="majorHAnsi" w:cstheme="majorBidi"/>
+        <w:rFonts w:ascii="Arial" w:hAnsi="Arial" w:eastAsia="Arial" w:cs="Arial"/>
         <w:b/>
         <w:bCs/>
       </w:rPr>
@@ -5703,7 +5820,7 @@
         <w:spacing w:before="0" w:after="0" w:line="240" w:lineRule="auto"/>
       </w:pPr>
       <w:rPr>
-        <w:rFonts w:asciiTheme="majorHAnsi" w:eastAsiaTheme="majorEastAsia" w:hAnsiTheme="majorHAnsi" w:cstheme="majorBidi"/>
+        <w:rFonts w:ascii="Arial" w:hAnsi="Arial" w:eastAsia="Arial" w:cs="Arial"/>
         <w:b/>
         <w:bCs/>
       </w:rPr>
@@ -5721,14 +5838,14 @@
     </w:tblStylePr>
     <w:tblStylePr w:type="firstCol">
       <w:rPr>
-        <w:rFonts w:asciiTheme="majorHAnsi" w:eastAsiaTheme="majorEastAsia" w:hAnsiTheme="majorHAnsi" w:cstheme="majorBidi"/>
+        <w:rFonts w:ascii="Arial" w:hAnsi="Arial" w:eastAsia="Arial" w:cs="Arial"/>
         <w:b/>
         <w:bCs/>
       </w:rPr>
     </w:tblStylePr>
     <w:tblStylePr w:type="lastCol">
       <w:rPr>
-        <w:rFonts w:asciiTheme="majorHAnsi" w:eastAsiaTheme="majorEastAsia" w:hAnsiTheme="majorHAnsi" w:cstheme="majorBidi"/>
+        <w:rFonts w:ascii="Arial" w:hAnsi="Arial" w:eastAsia="Arial" w:cs="Arial"/>
         <w:b/>
         <w:bCs/>
       </w:rPr>
@@ -5812,7 +5929,7 @@
         <w:spacing w:before="0" w:after="0" w:line="240" w:lineRule="auto"/>
       </w:pPr>
       <w:rPr>
-        <w:rFonts w:asciiTheme="majorHAnsi" w:eastAsiaTheme="majorEastAsia" w:hAnsiTheme="majorHAnsi" w:cstheme="majorBidi"/>
+        <w:rFonts w:ascii="Arial" w:hAnsi="Arial" w:eastAsia="Arial" w:cs="Arial"/>
         <w:b/>
         <w:bCs/>
       </w:rPr>
@@ -5833,7 +5950,7 @@
         <w:spacing w:before="0" w:after="0" w:line="240" w:lineRule="auto"/>
       </w:pPr>
       <w:rPr>
-        <w:rFonts w:asciiTheme="majorHAnsi" w:eastAsiaTheme="majorEastAsia" w:hAnsiTheme="majorHAnsi" w:cstheme="majorBidi"/>
+        <w:rFonts w:ascii="Arial" w:hAnsi="Arial" w:eastAsia="Arial" w:cs="Arial"/>
         <w:b/>
         <w:bCs/>
       </w:rPr>
@@ -5851,14 +5968,14 @@
     </w:tblStylePr>
     <w:tblStylePr w:type="firstCol">
       <w:rPr>
-        <w:rFonts w:asciiTheme="majorHAnsi" w:eastAsiaTheme="majorEastAsia" w:hAnsiTheme="majorHAnsi" w:cstheme="majorBidi"/>
+        <w:rFonts w:ascii="Arial" w:hAnsi="Arial" w:eastAsia="Arial" w:cs="Arial"/>
         <w:b/>
         <w:bCs/>
       </w:rPr>
     </w:tblStylePr>
     <w:tblStylePr w:type="lastCol">
       <w:rPr>
-        <w:rFonts w:asciiTheme="majorHAnsi" w:eastAsiaTheme="majorEastAsia" w:hAnsiTheme="majorHAnsi" w:cstheme="majorBidi"/>
+        <w:rFonts w:ascii="Arial" w:hAnsi="Arial" w:eastAsia="Arial" w:cs="Arial"/>
         <w:b/>
         <w:bCs/>
       </w:rPr>
@@ -5942,7 +6059,7 @@
         <w:spacing w:before="0" w:after="0" w:line="240" w:lineRule="auto"/>
       </w:pPr>
       <w:rPr>
-        <w:rFonts w:asciiTheme="majorHAnsi" w:eastAsiaTheme="majorEastAsia" w:hAnsiTheme="majorHAnsi" w:cstheme="majorBidi"/>
+        <w:rFonts w:ascii="Arial" w:hAnsi="Arial" w:eastAsia="Arial" w:cs="Arial"/>
         <w:b/>
         <w:bCs/>
       </w:rPr>
@@ -5963,7 +6080,7 @@
         <w:spacing w:before="0" w:after="0" w:line="240" w:lineRule="auto"/>
       </w:pPr>
       <w:rPr>
-        <w:rFonts w:asciiTheme="majorHAnsi" w:eastAsiaTheme="majorEastAsia" w:hAnsiTheme="majorHAnsi" w:cstheme="majorBidi"/>
+        <w:rFonts w:ascii="Arial" w:hAnsi="Arial" w:eastAsia="Arial" w:cs="Arial"/>
         <w:b/>
         <w:bCs/>
       </w:rPr>
@@ -5981,14 +6098,14 @@
     </w:tblStylePr>
     <w:tblStylePr w:type="firstCol">
       <w:rPr>
-        <w:rFonts w:asciiTheme="majorHAnsi" w:eastAsiaTheme="majorEastAsia" w:hAnsiTheme="majorHAnsi" w:cstheme="majorBidi"/>
+        <w:rFonts w:ascii="Arial" w:hAnsi="Arial" w:eastAsia="Arial" w:cs="Arial"/>
         <w:b/>
         <w:bCs/>
       </w:rPr>
     </w:tblStylePr>
     <w:tblStylePr w:type="lastCol">
       <w:rPr>
-        <w:rFonts w:asciiTheme="majorHAnsi" w:eastAsiaTheme="majorEastAsia" w:hAnsiTheme="majorHAnsi" w:cstheme="majorBidi"/>
+        <w:rFonts w:ascii="Arial" w:hAnsi="Arial" w:eastAsia="Arial" w:cs="Arial"/>
         <w:b/>
         <w:bCs/>
       </w:rPr>
@@ -6072,7 +6189,7 @@
         <w:spacing w:before="0" w:after="0" w:line="240" w:lineRule="auto"/>
       </w:pPr>
       <w:rPr>
-        <w:rFonts w:asciiTheme="majorHAnsi" w:eastAsiaTheme="majorEastAsia" w:hAnsiTheme="majorHAnsi" w:cstheme="majorBidi"/>
+        <w:rFonts w:ascii="Arial" w:hAnsi="Arial" w:eastAsia="Arial" w:cs="Arial"/>
         <w:b/>
         <w:bCs/>
       </w:rPr>
@@ -6093,7 +6210,7 @@
         <w:spacing w:before="0" w:after="0" w:line="240" w:lineRule="auto"/>
       </w:pPr>
       <w:rPr>
-        <w:rFonts w:asciiTheme="majorHAnsi" w:eastAsiaTheme="majorEastAsia" w:hAnsiTheme="majorHAnsi" w:cstheme="majorBidi"/>
+        <w:rFonts w:ascii="Arial" w:hAnsi="Arial" w:eastAsia="Arial" w:cs="Arial"/>
         <w:b/>
         <w:bCs/>
       </w:rPr>
@@ -6111,14 +6228,14 @@
     </w:tblStylePr>
     <w:tblStylePr w:type="firstCol">
       <w:rPr>
-        <w:rFonts w:asciiTheme="majorHAnsi" w:eastAsiaTheme="majorEastAsia" w:hAnsiTheme="majorHAnsi" w:cstheme="majorBidi"/>
+        <w:rFonts w:ascii="Arial" w:hAnsi="Arial" w:eastAsia="Arial" w:cs="Arial"/>
         <w:b/>
         <w:bCs/>
       </w:rPr>
     </w:tblStylePr>
     <w:tblStylePr w:type="lastCol">
       <w:rPr>
-        <w:rFonts w:asciiTheme="majorHAnsi" w:eastAsiaTheme="majorEastAsia" w:hAnsiTheme="majorHAnsi" w:cstheme="majorBidi"/>
+        <w:rFonts w:ascii="Arial" w:hAnsi="Arial" w:eastAsia="Arial" w:cs="Arial"/>
         <w:b/>
         <w:bCs/>
       </w:rPr>
@@ -6202,7 +6319,7 @@
         <w:spacing w:before="0" w:after="0" w:line="240" w:lineRule="auto"/>
       </w:pPr>
       <w:rPr>
-        <w:rFonts w:asciiTheme="majorHAnsi" w:eastAsiaTheme="majorEastAsia" w:hAnsiTheme="majorHAnsi" w:cstheme="majorBidi"/>
+        <w:rFonts w:ascii="Arial" w:hAnsi="Arial" w:eastAsia="Arial" w:cs="Arial"/>
         <w:b/>
         <w:bCs/>
       </w:rPr>
@@ -6223,7 +6340,7 @@
         <w:spacing w:before="0" w:after="0" w:line="240" w:lineRule="auto"/>
       </w:pPr>
       <w:rPr>
-        <w:rFonts w:asciiTheme="majorHAnsi" w:eastAsiaTheme="majorEastAsia" w:hAnsiTheme="majorHAnsi" w:cstheme="majorBidi"/>
+        <w:rFonts w:ascii="Arial" w:hAnsi="Arial" w:eastAsia="Arial" w:cs="Arial"/>
         <w:b/>
         <w:bCs/>
       </w:rPr>
@@ -6241,14 +6358,14 @@
     </w:tblStylePr>
     <w:tblStylePr w:type="firstCol">
       <w:rPr>
-        <w:rFonts w:asciiTheme="majorHAnsi" w:eastAsiaTheme="majorEastAsia" w:hAnsiTheme="majorHAnsi" w:cstheme="majorBidi"/>
+        <w:rFonts w:ascii="Arial" w:hAnsi="Arial" w:eastAsia="Arial" w:cs="Arial"/>
         <w:b/>
         <w:bCs/>
       </w:rPr>
     </w:tblStylePr>
     <w:tblStylePr w:type="lastCol">
       <w:rPr>
-        <w:rFonts w:asciiTheme="majorHAnsi" w:eastAsiaTheme="majorEastAsia" w:hAnsiTheme="majorHAnsi" w:cstheme="majorBidi"/>
+        <w:rFonts w:ascii="Arial" w:hAnsi="Arial" w:eastAsia="Arial" w:cs="Arial"/>
         <w:b/>
         <w:bCs/>
       </w:rPr>
@@ -6332,7 +6449,7 @@
         <w:spacing w:before="0" w:after="0" w:line="240" w:lineRule="auto"/>
       </w:pPr>
       <w:rPr>
-        <w:rFonts w:asciiTheme="majorHAnsi" w:eastAsiaTheme="majorEastAsia" w:hAnsiTheme="majorHAnsi" w:cstheme="majorBidi"/>
+        <w:rFonts w:ascii="Arial" w:hAnsi="Arial" w:eastAsia="Arial" w:cs="Arial"/>
         <w:b/>
         <w:bCs/>
       </w:rPr>
@@ -6353,7 +6470,7 @@
         <w:spacing w:before="0" w:after="0" w:line="240" w:lineRule="auto"/>
       </w:pPr>
       <w:rPr>
-        <w:rFonts w:asciiTheme="majorHAnsi" w:eastAsiaTheme="majorEastAsia" w:hAnsiTheme="majorHAnsi" w:cstheme="majorBidi"/>
+        <w:rFonts w:ascii="Arial" w:hAnsi="Arial" w:eastAsia="Arial" w:cs="Arial"/>
         <w:b/>
         <w:bCs/>
       </w:rPr>
@@ -6371,14 +6488,14 @@
     </w:tblStylePr>
     <w:tblStylePr w:type="firstCol">
       <w:rPr>
-        <w:rFonts w:asciiTheme="majorHAnsi" w:eastAsiaTheme="majorEastAsia" w:hAnsiTheme="majorHAnsi" w:cstheme="majorBidi"/>
+        <w:rFonts w:ascii="Arial" w:hAnsi="Arial" w:eastAsia="Arial" w:cs="Arial"/>
         <w:b/>
         <w:bCs/>
       </w:rPr>
     </w:tblStylePr>
     <w:tblStylePr w:type="lastCol">
       <w:rPr>
-        <w:rFonts w:asciiTheme="majorHAnsi" w:eastAsiaTheme="majorEastAsia" w:hAnsiTheme="majorHAnsi" w:cstheme="majorBidi"/>
+        <w:rFonts w:ascii="Arial" w:hAnsi="Arial" w:eastAsia="Arial" w:cs="Arial"/>
         <w:b/>
         <w:bCs/>
       </w:rPr>
@@ -6463,7 +6580,7 @@
       <w:rPr>
         <w:b/>
         <w:bCs/>
-        <w:color w:val="FFFFFF" w:themeColor="background1"/>
+        <w:color w:val="000000"/>
       </w:rPr>
       <w:tblPr/>
       <w:tcPr>
@@ -6569,7 +6686,7 @@
       <w:rPr>
         <w:b/>
         <w:bCs/>
-        <w:color w:val="FFFFFF" w:themeColor="background1"/>
+        <w:color w:val="000000"/>
       </w:rPr>
       <w:tblPr/>
       <w:tcPr>
@@ -6675,7 +6792,7 @@
       <w:rPr>
         <w:b/>
         <w:bCs/>
-        <w:color w:val="FFFFFF" w:themeColor="background1"/>
+        <w:color w:val="000000"/>
       </w:rPr>
       <w:tblPr/>
       <w:tcPr>
@@ -6781,7 +6898,7 @@
       <w:rPr>
         <w:b/>
         <w:bCs/>
-        <w:color w:val="FFFFFF" w:themeColor="background1"/>
+        <w:color w:val="000000"/>
       </w:rPr>
       <w:tblPr/>
       <w:tcPr>
@@ -6887,7 +7004,7 @@
       <w:rPr>
         <w:b/>
         <w:bCs/>
-        <w:color w:val="FFFFFF" w:themeColor="background1"/>
+        <w:color w:val="000000"/>
       </w:rPr>
       <w:tblPr/>
       <w:tcPr>
@@ -6993,7 +7110,7 @@
       <w:rPr>
         <w:b/>
         <w:bCs/>
-        <w:color w:val="FFFFFF" w:themeColor="background1"/>
+        <w:color w:val="000000"/>
       </w:rPr>
       <w:tblPr/>
       <w:tcPr>
@@ -7099,7 +7216,7 @@
       <w:rPr>
         <w:b/>
         <w:bCs/>
-        <w:color w:val="FFFFFF" w:themeColor="background1"/>
+        <w:color w:val="000000"/>
       </w:rPr>
       <w:tblPr/>
       <w:tcPr>
@@ -7202,7 +7319,7 @@
       <w:rPr>
         <w:b/>
         <w:bCs/>
-        <w:color w:val="FFFFFF" w:themeColor="background1"/>
+        <w:color w:val="000000"/>
       </w:rPr>
       <w:tblPr/>
       <w:tcPr>
@@ -7222,7 +7339,7 @@
         <w:spacing w:before="0" w:after="0" w:line="240" w:lineRule="auto"/>
       </w:pPr>
       <w:rPr>
-        <w:color w:val="auto"/>
+        <w:color w:val="000000"/>
       </w:rPr>
       <w:tblPr/>
       <w:tcPr>
@@ -7241,7 +7358,7 @@
       <w:rPr>
         <w:b/>
         <w:bCs/>
-        <w:color w:val="FFFFFF" w:themeColor="background1"/>
+        <w:color w:val="000000"/>
       </w:rPr>
       <w:tblPr/>
       <w:tcPr>
@@ -7260,7 +7377,7 @@
       <w:rPr>
         <w:b/>
         <w:bCs/>
-        <w:color w:val="FFFFFF" w:themeColor="background1"/>
+        <w:color w:val="000000"/>
       </w:rPr>
       <w:tblPr/>
       <w:tcPr>
@@ -7306,7 +7423,7 @@
     </w:tblStylePr>
     <w:tblStylePr w:type="nwCell">
       <w:rPr>
-        <w:color w:val="FFFFFF" w:themeColor="background1"/>
+        <w:color w:val="000000"/>
       </w:rPr>
       <w:tblPr/>
       <w:tcPr>
@@ -7351,7 +7468,7 @@
       <w:rPr>
         <w:b/>
         <w:bCs/>
-        <w:color w:val="FFFFFF" w:themeColor="background1"/>
+        <w:color w:val="000000"/>
       </w:rPr>
       <w:tblPr/>
       <w:tcPr>
@@ -7371,7 +7488,7 @@
         <w:spacing w:before="0" w:after="0" w:line="240" w:lineRule="auto"/>
       </w:pPr>
       <w:rPr>
-        <w:color w:val="auto"/>
+        <w:color w:val="000000"/>
       </w:rPr>
       <w:tblPr/>
       <w:tcPr>
@@ -7390,7 +7507,7 @@
       <w:rPr>
         <w:b/>
         <w:bCs/>
-        <w:color w:val="FFFFFF" w:themeColor="background1"/>
+        <w:color w:val="000000"/>
       </w:rPr>
       <w:tblPr/>
       <w:tcPr>
@@ -7409,7 +7526,7 @@
       <w:rPr>
         <w:b/>
         <w:bCs/>
-        <w:color w:val="FFFFFF" w:themeColor="background1"/>
+        <w:color w:val="000000"/>
       </w:rPr>
       <w:tblPr/>
       <w:tcPr>
@@ -7455,7 +7572,7 @@
     </w:tblStylePr>
     <w:tblStylePr w:type="nwCell">
       <w:rPr>
-        <w:color w:val="FFFFFF" w:themeColor="background1"/>
+        <w:color w:val="000000"/>
       </w:rPr>
       <w:tblPr/>
       <w:tcPr>
@@ -7500,7 +7617,7 @@
       <w:rPr>
         <w:b/>
         <w:bCs/>
-        <w:color w:val="FFFFFF" w:themeColor="background1"/>
+        <w:color w:val="000000"/>
       </w:rPr>
       <w:tblPr/>
       <w:tcPr>
@@ -7520,7 +7637,7 @@
         <w:spacing w:before="0" w:after="0" w:line="240" w:lineRule="auto"/>
       </w:pPr>
       <w:rPr>
-        <w:color w:val="auto"/>
+        <w:color w:val="000000"/>
       </w:rPr>
       <w:tblPr/>
       <w:tcPr>
@@ -7539,7 +7656,7 @@
       <w:rPr>
         <w:b/>
         <w:bCs/>
-        <w:color w:val="FFFFFF" w:themeColor="background1"/>
+        <w:color w:val="000000"/>
       </w:rPr>
       <w:tblPr/>
       <w:tcPr>
@@ -7558,7 +7675,7 @@
       <w:rPr>
         <w:b/>
         <w:bCs/>
-        <w:color w:val="FFFFFF" w:themeColor="background1"/>
+        <w:color w:val="000000"/>
       </w:rPr>
       <w:tblPr/>
       <w:tcPr>
@@ -7604,7 +7721,7 @@
     </w:tblStylePr>
     <w:tblStylePr w:type="nwCell">
       <w:rPr>
-        <w:color w:val="FFFFFF" w:themeColor="background1"/>
+        <w:color w:val="000000"/>
       </w:rPr>
       <w:tblPr/>
       <w:tcPr>
@@ -7649,7 +7766,7 @@
       <w:rPr>
         <w:b/>
         <w:bCs/>
-        <w:color w:val="FFFFFF" w:themeColor="background1"/>
+        <w:color w:val="000000"/>
       </w:rPr>
       <w:tblPr/>
       <w:tcPr>
@@ -7669,7 +7786,7 @@
         <w:spacing w:before="0" w:after="0" w:line="240" w:lineRule="auto"/>
       </w:pPr>
       <w:rPr>
-        <w:color w:val="auto"/>
+        <w:color w:val="000000"/>
       </w:rPr>
       <w:tblPr/>
       <w:tcPr>
@@ -7688,7 +7805,7 @@
       <w:rPr>
         <w:b/>
         <w:bCs/>
-        <w:color w:val="FFFFFF" w:themeColor="background1"/>
+        <w:color w:val="000000"/>
       </w:rPr>
       <w:tblPr/>
       <w:tcPr>
@@ -7707,7 +7824,7 @@
       <w:rPr>
         <w:b/>
         <w:bCs/>
-        <w:color w:val="FFFFFF" w:themeColor="background1"/>
+        <w:color w:val="000000"/>
       </w:rPr>
       <w:tblPr/>
       <w:tcPr>
@@ -7753,7 +7870,7 @@
     </w:tblStylePr>
     <w:tblStylePr w:type="nwCell">
       <w:rPr>
-        <w:color w:val="FFFFFF" w:themeColor="background1"/>
+        <w:color w:val="000000"/>
       </w:rPr>
       <w:tblPr/>
       <w:tcPr>
@@ -7798,7 +7915,7 @@
       <w:rPr>
         <w:b/>
         <w:bCs/>
-        <w:color w:val="FFFFFF" w:themeColor="background1"/>
+        <w:color w:val="000000"/>
       </w:rPr>
       <w:tblPr/>
       <w:tcPr>
@@ -7818,7 +7935,7 @@
         <w:spacing w:before="0" w:after="0" w:line="240" w:lineRule="auto"/>
       </w:pPr>
       <w:rPr>
-        <w:color w:val="auto"/>
+        <w:color w:val="000000"/>
       </w:rPr>
       <w:tblPr/>
       <w:tcPr>
@@ -7837,7 +7954,7 @@
       <w:rPr>
         <w:b/>
         <w:bCs/>
-        <w:color w:val="FFFFFF" w:themeColor="background1"/>
+        <w:color w:val="000000"/>
       </w:rPr>
       <w:tblPr/>
       <w:tcPr>
@@ -7856,7 +7973,7 @@
       <w:rPr>
         <w:b/>
         <w:bCs/>
-        <w:color w:val="FFFFFF" w:themeColor="background1"/>
+        <w:color w:val="000000"/>
       </w:rPr>
       <w:tblPr/>
       <w:tcPr>
@@ -7902,7 +8019,7 @@
     </w:tblStylePr>
     <w:tblStylePr w:type="nwCell">
       <w:rPr>
-        <w:color w:val="FFFFFF" w:themeColor="background1"/>
+        <w:color w:val="000000"/>
       </w:rPr>
       <w:tblPr/>
       <w:tcPr>
@@ -7947,7 +8064,7 @@
       <w:rPr>
         <w:b/>
         <w:bCs/>
-        <w:color w:val="FFFFFF" w:themeColor="background1"/>
+        <w:color w:val="000000"/>
       </w:rPr>
       <w:tblPr/>
       <w:tcPr>
@@ -7967,7 +8084,7 @@
         <w:spacing w:before="0" w:after="0" w:line="240" w:lineRule="auto"/>
       </w:pPr>
       <w:rPr>
-        <w:color w:val="auto"/>
+        <w:color w:val="000000"/>
       </w:rPr>
       <w:tblPr/>
       <w:tcPr>
@@ -7986,7 +8103,7 @@
       <w:rPr>
         <w:b/>
         <w:bCs/>
-        <w:color w:val="FFFFFF" w:themeColor="background1"/>
+        <w:color w:val="000000"/>
       </w:rPr>
       <w:tblPr/>
       <w:tcPr>
@@ -8005,7 +8122,7 @@
       <w:rPr>
         <w:b/>
         <w:bCs/>
-        <w:color w:val="FFFFFF" w:themeColor="background1"/>
+        <w:color w:val="000000"/>
       </w:rPr>
       <w:tblPr/>
       <w:tcPr>
@@ -8051,7 +8168,7 @@
     </w:tblStylePr>
     <w:tblStylePr w:type="nwCell">
       <w:rPr>
-        <w:color w:val="FFFFFF" w:themeColor="background1"/>
+        <w:color w:val="000000"/>
       </w:rPr>
       <w:tblPr/>
       <w:tcPr>
@@ -8096,7 +8213,7 @@
       <w:rPr>
         <w:b/>
         <w:bCs/>
-        <w:color w:val="FFFFFF" w:themeColor="background1"/>
+        <w:color w:val="000000"/>
       </w:rPr>
       <w:tblPr/>
       <w:tcPr>
@@ -8116,7 +8233,7 @@
         <w:spacing w:before="0" w:after="0" w:line="240" w:lineRule="auto"/>
       </w:pPr>
       <w:rPr>
-        <w:color w:val="auto"/>
+        <w:color w:val="000000"/>
       </w:rPr>
       <w:tblPr/>
       <w:tcPr>
@@ -8135,7 +8252,7 @@
       <w:rPr>
         <w:b/>
         <w:bCs/>
-        <w:color w:val="FFFFFF" w:themeColor="background1"/>
+        <w:color w:val="000000"/>
       </w:rPr>
       <w:tblPr/>
       <w:tcPr>
@@ -8154,7 +8271,7 @@
       <w:rPr>
         <w:b/>
         <w:bCs/>
-        <w:color w:val="FFFFFF" w:themeColor="background1"/>
+        <w:color w:val="000000"/>
       </w:rPr>
       <w:tblPr/>
       <w:tcPr>
@@ -8200,7 +8317,7 @@
     </w:tblStylePr>
     <w:tblStylePr w:type="nwCell">
       <w:rPr>
-        <w:color w:val="FFFFFF" w:themeColor="background1"/>
+        <w:color w:val="000000"/>
       </w:rPr>
       <w:tblPr/>
       <w:tcPr>
@@ -8224,7 +8341,7 @@
       <w:spacing w:after="0" w:line="240" w:lineRule="auto"/>
     </w:pPr>
     <w:rPr>
-      <w:color w:val="000000" w:themeColor="text1"/>
+      <w:color w:val="000000"/>
     </w:rPr>
     <w:tblPr>
       <w:tblStyleRowBandSize w:val="1"/>
@@ -8243,7 +8360,7 @@
     </w:tblPr>
     <w:tblStylePr w:type="firstRow">
       <w:rPr>
-        <w:rFonts w:asciiTheme="majorHAnsi" w:eastAsiaTheme="majorEastAsia" w:hAnsiTheme="majorHAnsi" w:cstheme="majorBidi"/>
+        <w:rFonts w:ascii="Arial" w:hAnsi="Arial" w:eastAsia="Arial" w:cs="Arial"/>
       </w:rPr>
       <w:tblPr/>
       <w:tcPr>
@@ -8257,7 +8374,7 @@
       <w:rPr>
         <w:b/>
         <w:bCs/>
-        <w:color w:val="1F497D" w:themeColor="text2"/>
+        <w:color w:val="000000"/>
       </w:rPr>
       <w:tblPr/>
       <w:tcPr>
@@ -8308,7 +8425,7 @@
       <w:spacing w:after="0" w:line="240" w:lineRule="auto"/>
     </w:pPr>
     <w:rPr>
-      <w:color w:val="000000" w:themeColor="text1"/>
+      <w:color w:val="000000"/>
     </w:rPr>
     <w:tblPr>
       <w:tblStyleRowBandSize w:val="1"/>
@@ -8327,7 +8444,7 @@
     </w:tblPr>
     <w:tblStylePr w:type="firstRow">
       <w:rPr>
-        <w:rFonts w:asciiTheme="majorHAnsi" w:eastAsiaTheme="majorEastAsia" w:hAnsiTheme="majorHAnsi" w:cstheme="majorBidi"/>
+        <w:rFonts w:ascii="Arial" w:hAnsi="Arial" w:eastAsia="Arial" w:cs="Arial"/>
       </w:rPr>
       <w:tblPr/>
       <w:tcPr>
@@ -8341,7 +8458,7 @@
       <w:rPr>
         <w:b/>
         <w:bCs/>
-        <w:color w:val="1F497D" w:themeColor="text2"/>
+        <w:color w:val="000000"/>
       </w:rPr>
       <w:tblPr/>
       <w:tcPr>
@@ -8392,7 +8509,7 @@
       <w:spacing w:after="0" w:line="240" w:lineRule="auto"/>
     </w:pPr>
     <w:rPr>
-      <w:color w:val="000000" w:themeColor="text1"/>
+      <w:color w:val="000000"/>
     </w:rPr>
     <w:tblPr>
       <w:tblStyleRowBandSize w:val="1"/>
@@ -8411,7 +8528,7 @@
     </w:tblPr>
     <w:tblStylePr w:type="firstRow">
       <w:rPr>
-        <w:rFonts w:asciiTheme="majorHAnsi" w:eastAsiaTheme="majorEastAsia" w:hAnsiTheme="majorHAnsi" w:cstheme="majorBidi"/>
+        <w:rFonts w:ascii="Arial" w:hAnsi="Arial" w:eastAsia="Arial" w:cs="Arial"/>
       </w:rPr>
       <w:tblPr/>
       <w:tcPr>
@@ -8425,7 +8542,7 @@
       <w:rPr>
         <w:b/>
         <w:bCs/>
-        <w:color w:val="1F497D" w:themeColor="text2"/>
+        <w:color w:val="000000"/>
       </w:rPr>
       <w:tblPr/>
       <w:tcPr>
@@ -8476,7 +8593,7 @@
       <w:spacing w:after="0" w:line="240" w:lineRule="auto"/>
     </w:pPr>
     <w:rPr>
-      <w:color w:val="000000" w:themeColor="text1"/>
+      <w:color w:val="000000"/>
     </w:rPr>
     <w:tblPr>
       <w:tblStyleRowBandSize w:val="1"/>
@@ -8495,7 +8612,7 @@
     </w:tblPr>
     <w:tblStylePr w:type="firstRow">
       <w:rPr>
-        <w:rFonts w:asciiTheme="majorHAnsi" w:eastAsiaTheme="majorEastAsia" w:hAnsiTheme="majorHAnsi" w:cstheme="majorBidi"/>
+        <w:rFonts w:ascii="Arial" w:hAnsi="Arial" w:eastAsia="Arial" w:cs="Arial"/>
       </w:rPr>
       <w:tblPr/>
       <w:tcPr>
@@ -8509,7 +8626,7 @@
       <w:rPr>
         <w:b/>
         <w:bCs/>
-        <w:color w:val="1F497D" w:themeColor="text2"/>
+        <w:color w:val="000000"/>
       </w:rPr>
       <w:tblPr/>
       <w:tcPr>
@@ -8560,7 +8677,7 @@
       <w:spacing w:after="0" w:line="240" w:lineRule="auto"/>
     </w:pPr>
     <w:rPr>
-      <w:color w:val="000000" w:themeColor="text1"/>
+      <w:color w:val="000000"/>
     </w:rPr>
     <w:tblPr>
       <w:tblStyleRowBandSize w:val="1"/>
@@ -8579,7 +8696,7 @@
     </w:tblPr>
     <w:tblStylePr w:type="firstRow">
       <w:rPr>
-        <w:rFonts w:asciiTheme="majorHAnsi" w:eastAsiaTheme="majorEastAsia" w:hAnsiTheme="majorHAnsi" w:cstheme="majorBidi"/>
+        <w:rFonts w:ascii="Arial" w:hAnsi="Arial" w:eastAsia="Arial" w:cs="Arial"/>
       </w:rPr>
       <w:tblPr/>
       <w:tcPr>
@@ -8593,7 +8710,7 @@
       <w:rPr>
         <w:b/>
         <w:bCs/>
-        <w:color w:val="1F497D" w:themeColor="text2"/>
+        <w:color w:val="000000"/>
       </w:rPr>
       <w:tblPr/>
       <w:tcPr>
@@ -8644,7 +8761,7 @@
       <w:spacing w:after="0" w:line="240" w:lineRule="auto"/>
     </w:pPr>
     <w:rPr>
-      <w:color w:val="000000" w:themeColor="text1"/>
+      <w:color w:val="000000"/>
     </w:rPr>
     <w:tblPr>
       <w:tblStyleRowBandSize w:val="1"/>
@@ -8663,7 +8780,7 @@
     </w:tblPr>
     <w:tblStylePr w:type="firstRow">
       <w:rPr>
-        <w:rFonts w:asciiTheme="majorHAnsi" w:eastAsiaTheme="majorEastAsia" w:hAnsiTheme="majorHAnsi" w:cstheme="majorBidi"/>
+        <w:rFonts w:ascii="Arial" w:hAnsi="Arial" w:eastAsia="Arial" w:cs="Arial"/>
       </w:rPr>
       <w:tblPr/>
       <w:tcPr>
@@ -8677,7 +8794,7 @@
       <w:rPr>
         <w:b/>
         <w:bCs/>
-        <w:color w:val="1F497D" w:themeColor="text2"/>
+        <w:color w:val="000000"/>
       </w:rPr>
       <w:tblPr/>
       <w:tcPr>
@@ -8728,7 +8845,7 @@
       <w:spacing w:after="0" w:line="240" w:lineRule="auto"/>
     </w:pPr>
     <w:rPr>
-      <w:color w:val="000000" w:themeColor="text1"/>
+      <w:color w:val="000000"/>
     </w:rPr>
     <w:tblPr>
       <w:tblStyleRowBandSize w:val="1"/>
@@ -8747,7 +8864,7 @@
     </w:tblPr>
     <w:tblStylePr w:type="firstRow">
       <w:rPr>
-        <w:rFonts w:asciiTheme="majorHAnsi" w:eastAsiaTheme="majorEastAsia" w:hAnsiTheme="majorHAnsi" w:cstheme="majorBidi"/>
+        <w:rFonts w:ascii="Arial" w:hAnsi="Arial" w:eastAsia="Arial" w:cs="Arial"/>
       </w:rPr>
       <w:tblPr/>
       <w:tcPr>
@@ -8761,7 +8878,7 @@
       <w:rPr>
         <w:b/>
         <w:bCs/>
-        <w:color w:val="1F497D" w:themeColor="text2"/>
+        <w:color w:val="000000"/>
       </w:rPr>
       <w:tblPr/>
       <w:tcPr>
@@ -8812,8 +8929,8 @@
       <w:spacing w:after="0" w:line="240" w:lineRule="auto"/>
     </w:pPr>
     <w:rPr>
-      <w:rFonts w:asciiTheme="majorHAnsi" w:eastAsiaTheme="majorEastAsia" w:hAnsiTheme="majorHAnsi" w:cstheme="majorBidi"/>
-      <w:color w:val="000000" w:themeColor="text1"/>
+      <w:rFonts w:ascii="Arial" w:hAnsi="Arial" w:eastAsia="Arial" w:cs="Arial"/>
+      <w:color w:val="000000"/>
     </w:rPr>
     <w:tblPr>
       <w:tblStyleRowBandSize w:val="1"/>
@@ -8940,8 +9057,8 @@
       <w:spacing w:after="0" w:line="240" w:lineRule="auto"/>
     </w:pPr>
     <w:rPr>
-      <w:rFonts w:asciiTheme="majorHAnsi" w:eastAsiaTheme="majorEastAsia" w:hAnsiTheme="majorHAnsi" w:cstheme="majorBidi"/>
-      <w:color w:val="000000" w:themeColor="text1"/>
+      <w:rFonts w:ascii="Arial" w:hAnsi="Arial" w:eastAsia="Arial" w:cs="Arial"/>
+      <w:color w:val="000000"/>
     </w:rPr>
     <w:tblPr>
       <w:tblStyleRowBandSize w:val="1"/>
@@ -9068,8 +9185,8 @@
       <w:spacing w:after="0" w:line="240" w:lineRule="auto"/>
     </w:pPr>
     <w:rPr>
-      <w:rFonts w:asciiTheme="majorHAnsi" w:eastAsiaTheme="majorEastAsia" w:hAnsiTheme="majorHAnsi" w:cstheme="majorBidi"/>
-      <w:color w:val="000000" w:themeColor="text1"/>
+      <w:rFonts w:ascii="Arial" w:hAnsi="Arial" w:eastAsia="Arial" w:cs="Arial"/>
+      <w:color w:val="000000"/>
     </w:rPr>
     <w:tblPr>
       <w:tblStyleRowBandSize w:val="1"/>
@@ -9196,8 +9313,8 @@
       <w:spacing w:after="0" w:line="240" w:lineRule="auto"/>
     </w:pPr>
     <w:rPr>
-      <w:rFonts w:asciiTheme="majorHAnsi" w:eastAsiaTheme="majorEastAsia" w:hAnsiTheme="majorHAnsi" w:cstheme="majorBidi"/>
-      <w:color w:val="000000" w:themeColor="text1"/>
+      <w:rFonts w:ascii="Arial" w:hAnsi="Arial" w:eastAsia="Arial" w:cs="Arial"/>
+      <w:color w:val="000000"/>
     </w:rPr>
     <w:tblPr>
       <w:tblStyleRowBandSize w:val="1"/>
@@ -9324,8 +9441,8 @@
       <w:spacing w:after="0" w:line="240" w:lineRule="auto"/>
     </w:pPr>
     <w:rPr>
-      <w:rFonts w:asciiTheme="majorHAnsi" w:eastAsiaTheme="majorEastAsia" w:hAnsiTheme="majorHAnsi" w:cstheme="majorBidi"/>
-      <w:color w:val="000000" w:themeColor="text1"/>
+      <w:rFonts w:ascii="Arial" w:hAnsi="Arial" w:eastAsia="Arial" w:cs="Arial"/>
+      <w:color w:val="000000"/>
     </w:rPr>
     <w:tblPr>
       <w:tblStyleRowBandSize w:val="1"/>
@@ -9452,8 +9569,8 @@
       <w:spacing w:after="0" w:line="240" w:lineRule="auto"/>
     </w:pPr>
     <w:rPr>
-      <w:rFonts w:asciiTheme="majorHAnsi" w:eastAsiaTheme="majorEastAsia" w:hAnsiTheme="majorHAnsi" w:cstheme="majorBidi"/>
-      <w:color w:val="000000" w:themeColor="text1"/>
+      <w:rFonts w:ascii="Arial" w:hAnsi="Arial" w:eastAsia="Arial" w:cs="Arial"/>
+      <w:color w:val="000000"/>
     </w:rPr>
     <w:tblPr>
       <w:tblStyleRowBandSize w:val="1"/>
@@ -9580,8 +9697,8 @@
       <w:spacing w:after="0" w:line="240" w:lineRule="auto"/>
     </w:pPr>
     <w:rPr>
-      <w:rFonts w:asciiTheme="majorHAnsi" w:eastAsiaTheme="majorEastAsia" w:hAnsiTheme="majorHAnsi" w:cstheme="majorBidi"/>
-      <w:color w:val="000000" w:themeColor="text1"/>
+      <w:rFonts w:ascii="Arial" w:hAnsi="Arial" w:eastAsia="Arial" w:cs="Arial"/>
+      <w:color w:val="000000"/>
     </w:rPr>
     <w:tblPr>
       <w:tblStyleRowBandSize w:val="1"/>
@@ -10219,8 +10336,8 @@
       <w:spacing w:after="0" w:line="240" w:lineRule="auto"/>
     </w:pPr>
     <w:rPr>
-      <w:rFonts w:asciiTheme="majorHAnsi" w:eastAsiaTheme="majorEastAsia" w:hAnsiTheme="majorHAnsi" w:cstheme="majorBidi"/>
-      <w:color w:val="000000" w:themeColor="text1"/>
+      <w:rFonts w:ascii="Arial" w:hAnsi="Arial" w:eastAsia="Arial" w:cs="Arial"/>
+      <w:color w:val="000000"/>
     </w:rPr>
     <w:tblPr>
       <w:tblStyleRowBandSize w:val="1"/>
@@ -10248,7 +10365,7 @@
       <w:rPr>
         <w:b/>
         <w:bCs/>
-        <w:color w:val="000000" w:themeColor="text1"/>
+        <w:color w:val="000000"/>
       </w:rPr>
       <w:tblPr/>
       <w:tcPr>
@@ -10259,7 +10376,7 @@
       <w:rPr>
         <w:b/>
         <w:bCs/>
-        <w:color w:val="000000" w:themeColor="text1"/>
+        <w:color w:val="000000"/>
       </w:rPr>
       <w:tblPr/>
       <w:tcPr>
@@ -10278,7 +10395,7 @@
       <w:rPr>
         <w:b/>
         <w:bCs/>
-        <w:color w:val="000000" w:themeColor="text1"/>
+        <w:color w:val="000000"/>
       </w:rPr>
       <w:tblPr/>
       <w:tcPr>
@@ -10297,7 +10414,7 @@
       <w:rPr>
         <w:b w:val="0"/>
         <w:bCs w:val="0"/>
-        <w:color w:val="000000" w:themeColor="text1"/>
+        <w:color w:val="000000"/>
       </w:rPr>
       <w:tblPr/>
       <w:tcPr>
@@ -10344,8 +10461,8 @@
       <w:spacing w:after="0" w:line="240" w:lineRule="auto"/>
     </w:pPr>
     <w:rPr>
-      <w:rFonts w:asciiTheme="majorHAnsi" w:eastAsiaTheme="majorEastAsia" w:hAnsiTheme="majorHAnsi" w:cstheme="majorBidi"/>
-      <w:color w:val="000000" w:themeColor="text1"/>
+      <w:rFonts w:ascii="Arial" w:hAnsi="Arial" w:eastAsia="Arial" w:cs="Arial"/>
+      <w:color w:val="000000"/>
     </w:rPr>
     <w:tblPr>
       <w:tblStyleRowBandSize w:val="1"/>
@@ -10373,7 +10490,7 @@
       <w:rPr>
         <w:b/>
         <w:bCs/>
-        <w:color w:val="000000" w:themeColor="text1"/>
+        <w:color w:val="000000"/>
       </w:rPr>
       <w:tblPr/>
       <w:tcPr>
@@ -10384,7 +10501,7 @@
       <w:rPr>
         <w:b/>
         <w:bCs/>
-        <w:color w:val="000000" w:themeColor="text1"/>
+        <w:color w:val="000000"/>
       </w:rPr>
       <w:tblPr/>
       <w:tcPr>
@@ -10403,7 +10520,7 @@
       <w:rPr>
         <w:b/>
         <w:bCs/>
-        <w:color w:val="000000" w:themeColor="text1"/>
+        <w:color w:val="000000"/>
       </w:rPr>
       <w:tblPr/>
       <w:tcPr>
@@ -10422,7 +10539,7 @@
       <w:rPr>
         <w:b w:val="0"/>
         <w:bCs w:val="0"/>
-        <w:color w:val="000000" w:themeColor="text1"/>
+        <w:color w:val="000000"/>
       </w:rPr>
       <w:tblPr/>
       <w:tcPr>
@@ -10469,8 +10586,8 @@
       <w:spacing w:after="0" w:line="240" w:lineRule="auto"/>
     </w:pPr>
     <w:rPr>
-      <w:rFonts w:asciiTheme="majorHAnsi" w:eastAsiaTheme="majorEastAsia" w:hAnsiTheme="majorHAnsi" w:cstheme="majorBidi"/>
-      <w:color w:val="000000" w:themeColor="text1"/>
+      <w:rFonts w:ascii="Arial" w:hAnsi="Arial" w:eastAsia="Arial" w:cs="Arial"/>
+      <w:color w:val="000000"/>
     </w:rPr>
     <w:tblPr>
       <w:tblStyleRowBandSize w:val="1"/>
@@ -10498,7 +10615,7 @@
       <w:rPr>
         <w:b/>
         <w:bCs/>
-        <w:color w:val="000000" w:themeColor="text1"/>
+        <w:color w:val="000000"/>
       </w:rPr>
       <w:tblPr/>
       <w:tcPr>
@@ -10509,7 +10626,7 @@
       <w:rPr>
         <w:b/>
         <w:bCs/>
-        <w:color w:val="000000" w:themeColor="text1"/>
+        <w:color w:val="000000"/>
       </w:rPr>
       <w:tblPr/>
       <w:tcPr>
@@ -10528,7 +10645,7 @@
       <w:rPr>
         <w:b/>
         <w:bCs/>
-        <w:color w:val="000000" w:themeColor="text1"/>
+        <w:color w:val="000000"/>
       </w:rPr>
       <w:tblPr/>
       <w:tcPr>
@@ -10547,7 +10664,7 @@
       <w:rPr>
         <w:b w:val="0"/>
         <w:bCs w:val="0"/>
-        <w:color w:val="000000" w:themeColor="text1"/>
+        <w:color w:val="000000"/>
       </w:rPr>
       <w:tblPr/>
       <w:tcPr>
@@ -10594,8 +10711,8 @@
       <w:spacing w:after="0" w:line="240" w:lineRule="auto"/>
     </w:pPr>
     <w:rPr>
-      <w:rFonts w:asciiTheme="majorHAnsi" w:eastAsiaTheme="majorEastAsia" w:hAnsiTheme="majorHAnsi" w:cstheme="majorBidi"/>
-      <w:color w:val="000000" w:themeColor="text1"/>
+      <w:rFonts w:ascii="Arial" w:hAnsi="Arial" w:eastAsia="Arial" w:cs="Arial"/>
+      <w:color w:val="000000"/>
     </w:rPr>
     <w:tblPr>
       <w:tblStyleRowBandSize w:val="1"/>
@@ -10623,7 +10740,7 @@
       <w:rPr>
         <w:b/>
         <w:bCs/>
-        <w:color w:val="000000" w:themeColor="text1"/>
+        <w:color w:val="000000"/>
       </w:rPr>
       <w:tblPr/>
       <w:tcPr>
@@ -10634,7 +10751,7 @@
       <w:rPr>
         <w:b/>
         <w:bCs/>
-        <w:color w:val="000000" w:themeColor="text1"/>
+        <w:color w:val="000000"/>
       </w:rPr>
       <w:tblPr/>
       <w:tcPr>
@@ -10653,7 +10770,7 @@
       <w:rPr>
         <w:b/>
         <w:bCs/>
-        <w:color w:val="000000" w:themeColor="text1"/>
+        <w:color w:val="000000"/>
       </w:rPr>
       <w:tblPr/>
       <w:tcPr>
@@ -10672,7 +10789,7 @@
       <w:rPr>
         <w:b w:val="0"/>
         <w:bCs w:val="0"/>
-        <w:color w:val="000000" w:themeColor="text1"/>
+        <w:color w:val="000000"/>
       </w:rPr>
       <w:tblPr/>
       <w:tcPr>
@@ -10719,8 +10836,8 @@
       <w:spacing w:after="0" w:line="240" w:lineRule="auto"/>
     </w:pPr>
     <w:rPr>
-      <w:rFonts w:asciiTheme="majorHAnsi" w:eastAsiaTheme="majorEastAsia" w:hAnsiTheme="majorHAnsi" w:cstheme="majorBidi"/>
-      <w:color w:val="000000" w:themeColor="text1"/>
+      <w:rFonts w:ascii="Arial" w:hAnsi="Arial" w:eastAsia="Arial" w:cs="Arial"/>
+      <w:color w:val="000000"/>
     </w:rPr>
     <w:tblPr>
       <w:tblStyleRowBandSize w:val="1"/>
@@ -10748,7 +10865,7 @@
       <w:rPr>
         <w:b/>
         <w:bCs/>
-        <w:color w:val="000000" w:themeColor="text1"/>
+        <w:color w:val="000000"/>
       </w:rPr>
       <w:tblPr/>
       <w:tcPr>
@@ -10759,7 +10876,7 @@
       <w:rPr>
         <w:b/>
         <w:bCs/>
-        <w:color w:val="000000" w:themeColor="text1"/>
+        <w:color w:val="000000"/>
       </w:rPr>
       <w:tblPr/>
       <w:tcPr>
@@ -10778,7 +10895,7 @@
       <w:rPr>
         <w:b/>
         <w:bCs/>
-        <w:color w:val="000000" w:themeColor="text1"/>
+        <w:color w:val="000000"/>
       </w:rPr>
       <w:tblPr/>
       <w:tcPr>
@@ -10797,7 +10914,7 @@
       <w:rPr>
         <w:b w:val="0"/>
         <w:bCs w:val="0"/>
-        <w:color w:val="000000" w:themeColor="text1"/>
+        <w:color w:val="000000"/>
       </w:rPr>
       <w:tblPr/>
       <w:tcPr>
@@ -10844,8 +10961,8 @@
       <w:spacing w:after="0" w:line="240" w:lineRule="auto"/>
     </w:pPr>
     <w:rPr>
-      <w:rFonts w:asciiTheme="majorHAnsi" w:eastAsiaTheme="majorEastAsia" w:hAnsiTheme="majorHAnsi" w:cstheme="majorBidi"/>
-      <w:color w:val="000000" w:themeColor="text1"/>
+      <w:rFonts w:ascii="Arial" w:hAnsi="Arial" w:eastAsia="Arial" w:cs="Arial"/>
+      <w:color w:val="000000"/>
     </w:rPr>
     <w:tblPr>
       <w:tblStyleRowBandSize w:val="1"/>
@@ -10873,7 +10990,7 @@
       <w:rPr>
         <w:b/>
         <w:bCs/>
-        <w:color w:val="000000" w:themeColor="text1"/>
+        <w:color w:val="000000"/>
       </w:rPr>
       <w:tblPr/>
       <w:tcPr>
@@ -10884,7 +11001,7 @@
       <w:rPr>
         <w:b/>
         <w:bCs/>
-        <w:color w:val="000000" w:themeColor="text1"/>
+        <w:color w:val="000000"/>
       </w:rPr>
       <w:tblPr/>
       <w:tcPr>
@@ -10903,7 +11020,7 @@
       <w:rPr>
         <w:b/>
         <w:bCs/>
-        <w:color w:val="000000" w:themeColor="text1"/>
+        <w:color w:val="000000"/>
       </w:rPr>
       <w:tblPr/>
       <w:tcPr>
@@ -10922,7 +11039,7 @@
       <w:rPr>
         <w:b w:val="0"/>
         <w:bCs w:val="0"/>
-        <w:color w:val="000000" w:themeColor="text1"/>
+        <w:color w:val="000000"/>
       </w:rPr>
       <w:tblPr/>
       <w:tcPr>
@@ -10969,8 +11086,8 @@
       <w:spacing w:after="0" w:line="240" w:lineRule="auto"/>
     </w:pPr>
     <w:rPr>
-      <w:rFonts w:asciiTheme="majorHAnsi" w:eastAsiaTheme="majorEastAsia" w:hAnsiTheme="majorHAnsi" w:cstheme="majorBidi"/>
-      <w:color w:val="000000" w:themeColor="text1"/>
+      <w:rFonts w:ascii="Arial" w:hAnsi="Arial" w:eastAsia="Arial" w:cs="Arial"/>
+      <w:color w:val="000000"/>
     </w:rPr>
     <w:tblPr>
       <w:tblStyleRowBandSize w:val="1"/>
@@ -10998,7 +11115,7 @@
       <w:rPr>
         <w:b/>
         <w:bCs/>
-        <w:color w:val="000000" w:themeColor="text1"/>
+        <w:color w:val="000000"/>
       </w:rPr>
       <w:tblPr/>
       <w:tcPr>
@@ -11009,7 +11126,7 @@
       <w:rPr>
         <w:b/>
         <w:bCs/>
-        <w:color w:val="000000" w:themeColor="text1"/>
+        <w:color w:val="000000"/>
       </w:rPr>
       <w:tblPr/>
       <w:tcPr>
@@ -11028,7 +11145,7 @@
       <w:rPr>
         <w:b/>
         <w:bCs/>
-        <w:color w:val="000000" w:themeColor="text1"/>
+        <w:color w:val="000000"/>
       </w:rPr>
       <w:tblPr/>
       <w:tcPr>
@@ -11047,7 +11164,7 @@
       <w:rPr>
         <w:b w:val="0"/>
         <w:bCs w:val="0"/>
-        <w:color w:val="000000" w:themeColor="text1"/>
+        <w:color w:val="000000"/>
       </w:rPr>
       <w:tblPr/>
       <w:tcPr>
@@ -11121,7 +11238,7 @@
         <w:bCs/>
         <w:i w:val="0"/>
         <w:iCs w:val="0"/>
-        <w:color w:val="FFFFFF" w:themeColor="background1"/>
+        <w:color w:val="000000"/>
       </w:rPr>
       <w:tblPr/>
       <w:tcPr>
@@ -11142,7 +11259,7 @@
         <w:bCs/>
         <w:i w:val="0"/>
         <w:iCs w:val="0"/>
-        <w:color w:val="FFFFFF" w:themeColor="background1"/>
+        <w:color w:val="000000"/>
       </w:rPr>
       <w:tblPr/>
       <w:tcPr>
@@ -11163,7 +11280,7 @@
         <w:bCs/>
         <w:i w:val="0"/>
         <w:iCs w:val="0"/>
-        <w:color w:val="FFFFFF" w:themeColor="background1"/>
+        <w:color w:val="000000"/>
       </w:rPr>
       <w:tblPr/>
       <w:tcPr>
@@ -11182,7 +11299,7 @@
         <w:bCs/>
         <w:i w:val="0"/>
         <w:iCs w:val="0"/>
-        <w:color w:val="FFFFFF" w:themeColor="background1"/>
+        <w:color w:val="000000"/>
       </w:rPr>
       <w:tblPr/>
       <w:tcPr>
@@ -11262,7 +11379,7 @@
         <w:bCs/>
         <w:i w:val="0"/>
         <w:iCs w:val="0"/>
-        <w:color w:val="FFFFFF" w:themeColor="background1"/>
+        <w:color w:val="000000"/>
       </w:rPr>
       <w:tblPr/>
       <w:tcPr>
@@ -11283,7 +11400,7 @@
         <w:bCs/>
         <w:i w:val="0"/>
         <w:iCs w:val="0"/>
-        <w:color w:val="FFFFFF" w:themeColor="background1"/>
+        <w:color w:val="000000"/>
       </w:rPr>
       <w:tblPr/>
       <w:tcPr>
@@ -11304,7 +11421,7 @@
         <w:bCs/>
         <w:i w:val="0"/>
         <w:iCs w:val="0"/>
-        <w:color w:val="FFFFFF" w:themeColor="background1"/>
+        <w:color w:val="000000"/>
       </w:rPr>
       <w:tblPr/>
       <w:tcPr>
@@ -11323,7 +11440,7 @@
         <w:bCs/>
         <w:i w:val="0"/>
         <w:iCs w:val="0"/>
-        <w:color w:val="FFFFFF" w:themeColor="background1"/>
+        <w:color w:val="000000"/>
       </w:rPr>
       <w:tblPr/>
       <w:tcPr>
@@ -11403,7 +11520,7 @@
         <w:bCs/>
         <w:i w:val="0"/>
         <w:iCs w:val="0"/>
-        <w:color w:val="FFFFFF" w:themeColor="background1"/>
+        <w:color w:val="000000"/>
       </w:rPr>
       <w:tblPr/>
       <w:tcPr>
@@ -11424,7 +11541,7 @@
         <w:bCs/>
         <w:i w:val="0"/>
         <w:iCs w:val="0"/>
-        <w:color w:val="FFFFFF" w:themeColor="background1"/>
+        <w:color w:val="000000"/>
       </w:rPr>
       <w:tblPr/>
       <w:tcPr>
@@ -11445,7 +11562,7 @@
         <w:bCs/>
         <w:i w:val="0"/>
         <w:iCs w:val="0"/>
-        <w:color w:val="FFFFFF" w:themeColor="background1"/>
+        <w:color w:val="000000"/>
       </w:rPr>
       <w:tblPr/>
       <w:tcPr>
@@ -11464,7 +11581,7 @@
         <w:bCs/>
         <w:i w:val="0"/>
         <w:iCs w:val="0"/>
-        <w:color w:val="FFFFFF" w:themeColor="background1"/>
+        <w:color w:val="000000"/>
       </w:rPr>
       <w:tblPr/>
       <w:tcPr>
@@ -11544,7 +11661,7 @@
         <w:bCs/>
         <w:i w:val="0"/>
         <w:iCs w:val="0"/>
-        <w:color w:val="FFFFFF" w:themeColor="background1"/>
+        <w:color w:val="000000"/>
       </w:rPr>
       <w:tblPr/>
       <w:tcPr>
@@ -11565,7 +11682,7 @@
         <w:bCs/>
         <w:i w:val="0"/>
         <w:iCs w:val="0"/>
-        <w:color w:val="FFFFFF" w:themeColor="background1"/>
+        <w:color w:val="000000"/>
       </w:rPr>
       <w:tblPr/>
       <w:tcPr>
@@ -11586,7 +11703,7 @@
         <w:bCs/>
         <w:i w:val="0"/>
         <w:iCs w:val="0"/>
-        <w:color w:val="FFFFFF" w:themeColor="background1"/>
+        <w:color w:val="000000"/>
       </w:rPr>
       <w:tblPr/>
       <w:tcPr>
@@ -11605,7 +11722,7 @@
         <w:bCs/>
         <w:i w:val="0"/>
         <w:iCs w:val="0"/>
-        <w:color w:val="FFFFFF" w:themeColor="background1"/>
+        <w:color w:val="000000"/>
       </w:rPr>
       <w:tblPr/>
       <w:tcPr>
@@ -11685,7 +11802,7 @@
         <w:bCs/>
         <w:i w:val="0"/>
         <w:iCs w:val="0"/>
-        <w:color w:val="FFFFFF" w:themeColor="background1"/>
+        <w:color w:val="000000"/>
       </w:rPr>
       <w:tblPr/>
       <w:tcPr>
@@ -11706,7 +11823,7 @@
         <w:bCs/>
         <w:i w:val="0"/>
         <w:iCs w:val="0"/>
-        <w:color w:val="FFFFFF" w:themeColor="background1"/>
+        <w:color w:val="000000"/>
       </w:rPr>
       <w:tblPr/>
       <w:tcPr>
@@ -11727,7 +11844,7 @@
         <w:bCs/>
         <w:i w:val="0"/>
         <w:iCs w:val="0"/>
-        <w:color w:val="FFFFFF" w:themeColor="background1"/>
+        <w:color w:val="000000"/>
       </w:rPr>
       <w:tblPr/>
       <w:tcPr>
@@ -11746,7 +11863,7 @@
         <w:bCs/>
         <w:i w:val="0"/>
         <w:iCs w:val="0"/>
-        <w:color w:val="FFFFFF" w:themeColor="background1"/>
+        <w:color w:val="000000"/>
       </w:rPr>
       <w:tblPr/>
       <w:tcPr>
@@ -11826,7 +11943,7 @@
         <w:bCs/>
         <w:i w:val="0"/>
         <w:iCs w:val="0"/>
-        <w:color w:val="FFFFFF" w:themeColor="background1"/>
+        <w:color w:val="000000"/>
       </w:rPr>
       <w:tblPr/>
       <w:tcPr>
@@ -11847,7 +11964,7 @@
         <w:bCs/>
         <w:i w:val="0"/>
         <w:iCs w:val="0"/>
-        <w:color w:val="FFFFFF" w:themeColor="background1"/>
+        <w:color w:val="000000"/>
       </w:rPr>
       <w:tblPr/>
       <w:tcPr>
@@ -11868,7 +11985,7 @@
         <w:bCs/>
         <w:i w:val="0"/>
         <w:iCs w:val="0"/>
-        <w:color w:val="FFFFFF" w:themeColor="background1"/>
+        <w:color w:val="000000"/>
       </w:rPr>
       <w:tblPr/>
       <w:tcPr>
@@ -11887,7 +12004,7 @@
         <w:bCs/>
         <w:i w:val="0"/>
         <w:iCs w:val="0"/>
-        <w:color w:val="FFFFFF" w:themeColor="background1"/>
+        <w:color w:val="000000"/>
       </w:rPr>
       <w:tblPr/>
       <w:tcPr>
@@ -11967,7 +12084,7 @@
         <w:bCs/>
         <w:i w:val="0"/>
         <w:iCs w:val="0"/>
-        <w:color w:val="FFFFFF" w:themeColor="background1"/>
+        <w:color w:val="000000"/>
       </w:rPr>
       <w:tblPr/>
       <w:tcPr>
@@ -11988,7 +12105,7 @@
         <w:bCs/>
         <w:i w:val="0"/>
         <w:iCs w:val="0"/>
-        <w:color w:val="FFFFFF" w:themeColor="background1"/>
+        <w:color w:val="000000"/>
       </w:rPr>
       <w:tblPr/>
       <w:tcPr>
@@ -12009,7 +12126,7 @@
         <w:bCs/>
         <w:i w:val="0"/>
         <w:iCs w:val="0"/>
-        <w:color w:val="FFFFFF" w:themeColor="background1"/>
+        <w:color w:val="000000"/>
       </w:rPr>
       <w:tblPr/>
       <w:tcPr>
@@ -12028,7 +12145,7 @@
         <w:bCs/>
         <w:i w:val="0"/>
         <w:iCs w:val="0"/>
-        <w:color w:val="FFFFFF" w:themeColor="background1"/>
+        <w:color w:val="000000"/>
       </w:rPr>
       <w:tblPr/>
       <w:tcPr>
@@ -12081,7 +12198,7 @@
       <w:spacing w:after="0" w:line="240" w:lineRule="auto"/>
     </w:pPr>
     <w:rPr>
-      <w:color w:val="FFFFFF" w:themeColor="background1"/>
+      <w:color w:val="000000"/>
     </w:rPr>
     <w:tblPr>
       <w:tblStyleRowBandSize w:val="1"/>
@@ -12195,7 +12312,7 @@
       <w:spacing w:after="0" w:line="240" w:lineRule="auto"/>
     </w:pPr>
     <w:rPr>
-      <w:color w:val="FFFFFF" w:themeColor="background1"/>
+      <w:color w:val="000000"/>
     </w:rPr>
     <w:tblPr>
       <w:tblStyleRowBandSize w:val="1"/>
@@ -12309,7 +12426,7 @@
       <w:spacing w:after="0" w:line="240" w:lineRule="auto"/>
     </w:pPr>
     <w:rPr>
-      <w:color w:val="FFFFFF" w:themeColor="background1"/>
+      <w:color w:val="000000"/>
     </w:rPr>
     <w:tblPr>
       <w:tblStyleRowBandSize w:val="1"/>
@@ -12423,7 +12540,7 @@
       <w:spacing w:after="0" w:line="240" w:lineRule="auto"/>
     </w:pPr>
     <w:rPr>
-      <w:color w:val="FFFFFF" w:themeColor="background1"/>
+      <w:color w:val="000000"/>
     </w:rPr>
     <w:tblPr>
       <w:tblStyleRowBandSize w:val="1"/>
@@ -12537,7 +12654,7 @@
       <w:spacing w:after="0" w:line="240" w:lineRule="auto"/>
     </w:pPr>
     <w:rPr>
-      <w:color w:val="FFFFFF" w:themeColor="background1"/>
+      <w:color w:val="000000"/>
     </w:rPr>
     <w:tblPr>
       <w:tblStyleRowBandSize w:val="1"/>
@@ -12651,7 +12768,7 @@
       <w:spacing w:after="0" w:line="240" w:lineRule="auto"/>
     </w:pPr>
     <w:rPr>
-      <w:color w:val="FFFFFF" w:themeColor="background1"/>
+      <w:color w:val="000000"/>
     </w:rPr>
     <w:tblPr>
       <w:tblStyleRowBandSize w:val="1"/>
@@ -12765,7 +12882,7 @@
       <w:spacing w:after="0" w:line="240" w:lineRule="auto"/>
     </w:pPr>
     <w:rPr>
-      <w:color w:val="FFFFFF" w:themeColor="background1"/>
+      <w:color w:val="000000"/>
     </w:rPr>
     <w:tblPr>
       <w:tblStyleRowBandSize w:val="1"/>
@@ -12879,7 +12996,7 @@
       <w:spacing w:after="0" w:line="240" w:lineRule="auto"/>
     </w:pPr>
     <w:rPr>
-      <w:color w:val="000000" w:themeColor="text1"/>
+      <w:color w:val="000000"/>
     </w:rPr>
     <w:tblPr>
       <w:tblStyleRowBandSize w:val="1"/>
@@ -12925,7 +13042,7 @@
       <w:rPr>
         <w:b/>
         <w:bCs/>
-        <w:color w:val="FFFFFF" w:themeColor="background1"/>
+        <w:color w:val="000000"/>
       </w:rPr>
       <w:tblPr/>
       <w:tcPr>
@@ -12937,7 +13054,7 @@
     </w:tblStylePr>
     <w:tblStylePr w:type="firstCol">
       <w:rPr>
-        <w:color w:val="FFFFFF" w:themeColor="background1"/>
+        <w:color w:val="000000"/>
       </w:rPr>
       <w:tblPr/>
       <w:tcPr>
@@ -12954,7 +13071,7 @@
     </w:tblStylePr>
     <w:tblStylePr w:type="lastCol">
       <w:rPr>
-        <w:color w:val="FFFFFF" w:themeColor="background1"/>
+        <w:color w:val="000000"/>
       </w:rPr>
       <w:tblPr/>
       <w:tcPr>
@@ -12983,12 +13100,12 @@
     </w:tblStylePr>
     <w:tblStylePr w:type="neCell">
       <w:rPr>
-        <w:color w:val="000000" w:themeColor="text1"/>
+        <w:color w:val="000000"/>
       </w:rPr>
     </w:tblStylePr>
     <w:tblStylePr w:type="nwCell">
       <w:rPr>
-        <w:color w:val="000000" w:themeColor="text1"/>
+        <w:color w:val="000000"/>
       </w:rPr>
     </w:tblStylePr>
   </w:style>
@@ -13001,7 +13118,7 @@
       <w:spacing w:after="0" w:line="240" w:lineRule="auto"/>
     </w:pPr>
     <w:rPr>
-      <w:color w:val="000000" w:themeColor="text1"/>
+      <w:color w:val="000000"/>
     </w:rPr>
     <w:tblPr>
       <w:tblStyleRowBandSize w:val="1"/>
@@ -13047,7 +13164,7 @@
       <w:rPr>
         <w:b/>
         <w:bCs/>
-        <w:color w:val="FFFFFF" w:themeColor="background1"/>
+        <w:color w:val="000000"/>
       </w:rPr>
       <w:tblPr/>
       <w:tcPr>
@@ -13059,7 +13176,7 @@
     </w:tblStylePr>
     <w:tblStylePr w:type="firstCol">
       <w:rPr>
-        <w:color w:val="FFFFFF" w:themeColor="background1"/>
+        <w:color w:val="000000"/>
       </w:rPr>
       <w:tblPr/>
       <w:tcPr>
@@ -13076,7 +13193,7 @@
     </w:tblStylePr>
     <w:tblStylePr w:type="lastCol">
       <w:rPr>
-        <w:color w:val="FFFFFF" w:themeColor="background1"/>
+        <w:color w:val="000000"/>
       </w:rPr>
       <w:tblPr/>
       <w:tcPr>
@@ -13105,12 +13222,12 @@
     </w:tblStylePr>
     <w:tblStylePr w:type="neCell">
       <w:rPr>
-        <w:color w:val="000000" w:themeColor="text1"/>
+        <w:color w:val="000000"/>
       </w:rPr>
     </w:tblStylePr>
     <w:tblStylePr w:type="nwCell">
       <w:rPr>
-        <w:color w:val="000000" w:themeColor="text1"/>
+        <w:color w:val="000000"/>
       </w:rPr>
     </w:tblStylePr>
   </w:style>
@@ -13123,7 +13240,7 @@
       <w:spacing w:after="0" w:line="240" w:lineRule="auto"/>
     </w:pPr>
     <w:rPr>
-      <w:color w:val="000000" w:themeColor="text1"/>
+      <w:color w:val="000000"/>
     </w:rPr>
     <w:tblPr>
       <w:tblStyleRowBandSize w:val="1"/>
@@ -13169,7 +13286,7 @@
       <w:rPr>
         <w:b/>
         <w:bCs/>
-        <w:color w:val="FFFFFF" w:themeColor="background1"/>
+        <w:color w:val="000000"/>
       </w:rPr>
       <w:tblPr/>
       <w:tcPr>
@@ -13181,7 +13298,7 @@
     </w:tblStylePr>
     <w:tblStylePr w:type="firstCol">
       <w:rPr>
-        <w:color w:val="FFFFFF" w:themeColor="background1"/>
+        <w:color w:val="000000"/>
       </w:rPr>
       <w:tblPr/>
       <w:tcPr>
@@ -13198,7 +13315,7 @@
     </w:tblStylePr>
     <w:tblStylePr w:type="lastCol">
       <w:rPr>
-        <w:color w:val="FFFFFF" w:themeColor="background1"/>
+        <w:color w:val="000000"/>
       </w:rPr>
       <w:tblPr/>
       <w:tcPr>
@@ -13227,12 +13344,12 @@
     </w:tblStylePr>
     <w:tblStylePr w:type="neCell">
       <w:rPr>
-        <w:color w:val="000000" w:themeColor="text1"/>
+        <w:color w:val="000000"/>
       </w:rPr>
     </w:tblStylePr>
     <w:tblStylePr w:type="nwCell">
       <w:rPr>
-        <w:color w:val="000000" w:themeColor="text1"/>
+        <w:color w:val="000000"/>
       </w:rPr>
     </w:tblStylePr>
   </w:style>
@@ -13245,7 +13362,7 @@
       <w:spacing w:after="0" w:line="240" w:lineRule="auto"/>
     </w:pPr>
     <w:rPr>
-      <w:color w:val="000000" w:themeColor="text1"/>
+      <w:color w:val="000000"/>
     </w:rPr>
     <w:tblPr>
       <w:tblStyleRowBandSize w:val="1"/>
@@ -13291,7 +13408,7 @@
       <w:rPr>
         <w:b/>
         <w:bCs/>
-        <w:color w:val="FFFFFF" w:themeColor="background1"/>
+        <w:color w:val="000000"/>
       </w:rPr>
       <w:tblPr/>
       <w:tcPr>
@@ -13303,7 +13420,7 @@
     </w:tblStylePr>
     <w:tblStylePr w:type="firstCol">
       <w:rPr>
-        <w:color w:val="FFFFFF" w:themeColor="background1"/>
+        <w:color w:val="000000"/>
       </w:rPr>
       <w:tblPr/>
       <w:tcPr>
@@ -13320,7 +13437,7 @@
     </w:tblStylePr>
     <w:tblStylePr w:type="lastCol">
       <w:rPr>
-        <w:color w:val="FFFFFF" w:themeColor="background1"/>
+        <w:color w:val="000000"/>
       </w:rPr>
       <w:tblPr/>
       <w:tcPr>
@@ -13357,7 +13474,7 @@
       <w:spacing w:after="0" w:line="240" w:lineRule="auto"/>
     </w:pPr>
     <w:rPr>
-      <w:color w:val="000000" w:themeColor="text1"/>
+      <w:color w:val="000000"/>
     </w:rPr>
     <w:tblPr>
       <w:tblStyleRowBandSize w:val="1"/>
@@ -13403,7 +13520,7 @@
       <w:rPr>
         <w:b/>
         <w:bCs/>
-        <w:color w:val="FFFFFF" w:themeColor="background1"/>
+        <w:color w:val="000000"/>
       </w:rPr>
       <w:tblPr/>
       <w:tcPr>
@@ -13415,7 +13532,7 @@
     </w:tblStylePr>
     <w:tblStylePr w:type="firstCol">
       <w:rPr>
-        <w:color w:val="FFFFFF" w:themeColor="background1"/>
+        <w:color w:val="000000"/>
       </w:rPr>
       <w:tblPr/>
       <w:tcPr>
@@ -13432,7 +13549,7 @@
     </w:tblStylePr>
     <w:tblStylePr w:type="lastCol">
       <w:rPr>
-        <w:color w:val="FFFFFF" w:themeColor="background1"/>
+        <w:color w:val="000000"/>
       </w:rPr>
       <w:tblPr/>
       <w:tcPr>
@@ -13461,12 +13578,12 @@
     </w:tblStylePr>
     <w:tblStylePr w:type="neCell">
       <w:rPr>
-        <w:color w:val="000000" w:themeColor="text1"/>
+        <w:color w:val="000000"/>
       </w:rPr>
     </w:tblStylePr>
     <w:tblStylePr w:type="nwCell">
       <w:rPr>
-        <w:color w:val="000000" w:themeColor="text1"/>
+        <w:color w:val="000000"/>
       </w:rPr>
     </w:tblStylePr>
   </w:style>
@@ -13479,7 +13596,7 @@
       <w:spacing w:after="0" w:line="240" w:lineRule="auto"/>
     </w:pPr>
     <w:rPr>
-      <w:color w:val="000000" w:themeColor="text1"/>
+      <w:color w:val="000000"/>
     </w:rPr>
     <w:tblPr>
       <w:tblStyleRowBandSize w:val="1"/>
@@ -13525,7 +13642,7 @@
       <w:rPr>
         <w:b/>
         <w:bCs/>
-        <w:color w:val="FFFFFF" w:themeColor="background1"/>
+        <w:color w:val="000000"/>
       </w:rPr>
       <w:tblPr/>
       <w:tcPr>
@@ -13537,7 +13654,7 @@
     </w:tblStylePr>
     <w:tblStylePr w:type="firstCol">
       <w:rPr>
-        <w:color w:val="FFFFFF" w:themeColor="background1"/>
+        <w:color w:val="000000"/>
       </w:rPr>
       <w:tblPr/>
       <w:tcPr>
@@ -13554,7 +13671,7 @@
     </w:tblStylePr>
     <w:tblStylePr w:type="lastCol">
       <w:rPr>
-        <w:color w:val="FFFFFF" w:themeColor="background1"/>
+        <w:color w:val="000000"/>
       </w:rPr>
       <w:tblPr/>
       <w:tcPr>
@@ -13583,12 +13700,12 @@
     </w:tblStylePr>
     <w:tblStylePr w:type="neCell">
       <w:rPr>
-        <w:color w:val="000000" w:themeColor="text1"/>
+        <w:color w:val="000000"/>
       </w:rPr>
     </w:tblStylePr>
     <w:tblStylePr w:type="nwCell">
       <w:rPr>
-        <w:color w:val="000000" w:themeColor="text1"/>
+        <w:color w:val="000000"/>
       </w:rPr>
     </w:tblStylePr>
   </w:style>
@@ -13601,7 +13718,7 @@
       <w:spacing w:after="0" w:line="240" w:lineRule="auto"/>
     </w:pPr>
     <w:rPr>
-      <w:color w:val="000000" w:themeColor="text1"/>
+      <w:color w:val="000000"/>
     </w:rPr>
     <w:tblPr>
       <w:tblStyleRowBandSize w:val="1"/>
@@ -13647,7 +13764,7 @@
       <w:rPr>
         <w:b/>
         <w:bCs/>
-        <w:color w:val="FFFFFF" w:themeColor="background1"/>
+        <w:color w:val="000000"/>
       </w:rPr>
       <w:tblPr/>
       <w:tcPr>
@@ -13659,7 +13776,7 @@
     </w:tblStylePr>
     <w:tblStylePr w:type="firstCol">
       <w:rPr>
-        <w:color w:val="FFFFFF" w:themeColor="background1"/>
+        <w:color w:val="000000"/>
       </w:rPr>
       <w:tblPr/>
       <w:tcPr>
@@ -13676,7 +13793,7 @@
     </w:tblStylePr>
     <w:tblStylePr w:type="lastCol">
       <w:rPr>
-        <w:color w:val="FFFFFF" w:themeColor="background1"/>
+        <w:color w:val="000000"/>
       </w:rPr>
       <w:tblPr/>
       <w:tcPr>
@@ -13705,12 +13822,12 @@
     </w:tblStylePr>
     <w:tblStylePr w:type="neCell">
       <w:rPr>
-        <w:color w:val="000000" w:themeColor="text1"/>
+        <w:color w:val="000000"/>
       </w:rPr>
     </w:tblStylePr>
     <w:tblStylePr w:type="nwCell">
       <w:rPr>
-        <w:color w:val="000000" w:themeColor="text1"/>
+        <w:color w:val="000000"/>
       </w:rPr>
     </w:tblStylePr>
   </w:style>
@@ -13723,7 +13840,7 @@
       <w:spacing w:after="0" w:line="240" w:lineRule="auto"/>
     </w:pPr>
     <w:rPr>
-      <w:color w:val="000000" w:themeColor="text1"/>
+      <w:color w:val="000000"/>
     </w:rPr>
     <w:tblPr>
       <w:tblStyleRowBandSize w:val="1"/>
@@ -13743,7 +13860,7 @@
       <w:rPr>
         <w:b/>
         <w:bCs/>
-        <w:color w:val="FFFFFF" w:themeColor="background1"/>
+        <w:color w:val="000000"/>
       </w:rPr>
       <w:tblPr/>
       <w:tcPr>
@@ -13757,7 +13874,7 @@
       <w:rPr>
         <w:b/>
         <w:bCs/>
-        <w:color w:val="9E3A38" w:themeColor="accent2" w:themeShade="CC"/>
+        <w:color w:val="000000"/>
       </w:rPr>
       <w:tblPr/>
       <w:tcPr>
@@ -13809,7 +13926,7 @@
       <w:spacing w:after="0" w:line="240" w:lineRule="auto"/>
     </w:pPr>
     <w:rPr>
-      <w:color w:val="000000" w:themeColor="text1"/>
+      <w:color w:val="000000"/>
     </w:rPr>
     <w:tblPr>
       <w:tblStyleRowBandSize w:val="1"/>
@@ -13829,7 +13946,7 @@
       <w:rPr>
         <w:b/>
         <w:bCs/>
-        <w:color w:val="FFFFFF" w:themeColor="background1"/>
+        <w:color w:val="000000"/>
       </w:rPr>
       <w:tblPr/>
       <w:tcPr>
@@ -13843,7 +13960,7 @@
       <w:rPr>
         <w:b/>
         <w:bCs/>
-        <w:color w:val="9E3A38" w:themeColor="accent2" w:themeShade="CC"/>
+        <w:color w:val="000000"/>
       </w:rPr>
       <w:tblPr/>
       <w:tcPr>
@@ -13895,7 +14012,7 @@
       <w:spacing w:after="0" w:line="240" w:lineRule="auto"/>
     </w:pPr>
     <w:rPr>
-      <w:color w:val="000000" w:themeColor="text1"/>
+      <w:color w:val="000000"/>
     </w:rPr>
     <w:tblPr>
       <w:tblStyleRowBandSize w:val="1"/>
@@ -13915,7 +14032,7 @@
       <w:rPr>
         <w:b/>
         <w:bCs/>
-        <w:color w:val="FFFFFF" w:themeColor="background1"/>
+        <w:color w:val="000000"/>
       </w:rPr>
       <w:tblPr/>
       <w:tcPr>
@@ -13929,7 +14046,7 @@
       <w:rPr>
         <w:b/>
         <w:bCs/>
-        <w:color w:val="9E3A38" w:themeColor="accent2" w:themeShade="CC"/>
+        <w:color w:val="000000"/>
       </w:rPr>
       <w:tblPr/>
       <w:tcPr>
@@ -13981,7 +14098,7 @@
       <w:spacing w:after="0" w:line="240" w:lineRule="auto"/>
     </w:pPr>
     <w:rPr>
-      <w:color w:val="000000" w:themeColor="text1"/>
+      <w:color w:val="000000"/>
     </w:rPr>
     <w:tblPr>
       <w:tblStyleRowBandSize w:val="1"/>
@@ -14001,7 +14118,7 @@
       <w:rPr>
         <w:b/>
         <w:bCs/>
-        <w:color w:val="FFFFFF" w:themeColor="background1"/>
+        <w:color w:val="000000"/>
       </w:rPr>
       <w:tblPr/>
       <w:tcPr>
@@ -14015,7 +14132,7 @@
       <w:rPr>
         <w:b/>
         <w:bCs/>
-        <w:color w:val="664E82" w:themeColor="accent4" w:themeShade="CC"/>
+        <w:color w:val="000000"/>
       </w:rPr>
       <w:tblPr/>
       <w:tcPr>
@@ -14067,7 +14184,7 @@
       <w:spacing w:after="0" w:line="240" w:lineRule="auto"/>
     </w:pPr>
     <w:rPr>
-      <w:color w:val="000000" w:themeColor="text1"/>
+      <w:color w:val="000000"/>
     </w:rPr>
     <w:tblPr>
       <w:tblStyleRowBandSize w:val="1"/>
@@ -14087,7 +14204,7 @@
       <w:rPr>
         <w:b/>
         <w:bCs/>
-        <w:color w:val="FFFFFF" w:themeColor="background1"/>
+        <w:color w:val="000000"/>
       </w:rPr>
       <w:tblPr/>
       <w:tcPr>
@@ -14101,7 +14218,7 @@
       <w:rPr>
         <w:b/>
         <w:bCs/>
-        <w:color w:val="7E9C40" w:themeColor="accent3" w:themeShade="CC"/>
+        <w:color w:val="000000"/>
       </w:rPr>
       <w:tblPr/>
       <w:tcPr>
@@ -14153,7 +14270,7 @@
       <w:spacing w:after="0" w:line="240" w:lineRule="auto"/>
     </w:pPr>
     <w:rPr>
-      <w:color w:val="000000" w:themeColor="text1"/>
+      <w:color w:val="000000"/>
     </w:rPr>
     <w:tblPr>
       <w:tblStyleRowBandSize w:val="1"/>
@@ -14173,7 +14290,7 @@
       <w:rPr>
         <w:b/>
         <w:bCs/>
-        <w:color w:val="FFFFFF" w:themeColor="background1"/>
+        <w:color w:val="000000"/>
       </w:rPr>
       <w:tblPr/>
       <w:tcPr>
@@ -14187,7 +14304,7 @@
       <w:rPr>
         <w:b/>
         <w:bCs/>
-        <w:color w:val="F2730A" w:themeColor="accent6" w:themeShade="CC"/>
+        <w:color w:val="000000"/>
       </w:rPr>
       <w:tblPr/>
       <w:tcPr>
@@ -14239,7 +14356,7 @@
       <w:spacing w:after="0" w:line="240" w:lineRule="auto"/>
     </w:pPr>
     <w:rPr>
-      <w:color w:val="000000" w:themeColor="text1"/>
+      <w:color w:val="000000"/>
     </w:rPr>
     <w:tblPr>
       <w:tblStyleRowBandSize w:val="1"/>
@@ -14259,7 +14376,7 @@
       <w:rPr>
         <w:b/>
         <w:bCs/>
-        <w:color w:val="FFFFFF" w:themeColor="background1"/>
+        <w:color w:val="000000"/>
       </w:rPr>
       <w:tblPr/>
       <w:tcPr>
@@ -14273,7 +14390,7 @@
       <w:rPr>
         <w:b/>
         <w:bCs/>
-        <w:color w:val="348DA5" w:themeColor="accent5" w:themeShade="CC"/>
+        <w:color w:val="000000"/>
       </w:rPr>
       <w:tblPr/>
       <w:tcPr>
@@ -14325,7 +14442,7 @@
       <w:spacing w:after="0" w:line="240" w:lineRule="auto"/>
     </w:pPr>
     <w:rPr>
-      <w:color w:val="000000" w:themeColor="text1"/>
+      <w:color w:val="000000"/>
     </w:rPr>
     <w:tblPr>
       <w:tblStyleRowBandSize w:val="1"/>
@@ -14358,7 +14475,7 @@
       <w:rPr>
         <w:b/>
         <w:bCs/>
-        <w:color w:val="000000" w:themeColor="text1"/>
+        <w:color w:val="000000"/>
       </w:rPr>
       <w:tblPr/>
       <w:tcPr>
@@ -14367,7 +14484,7 @@
     </w:tblStylePr>
     <w:tblStylePr w:type="firstCol">
       <w:rPr>
-        <w:color w:val="FFFFFF" w:themeColor="background1"/>
+        <w:color w:val="000000"/>
       </w:rPr>
       <w:tblPr/>
       <w:tcPr>
@@ -14376,7 +14493,7 @@
     </w:tblStylePr>
     <w:tblStylePr w:type="lastCol">
       <w:rPr>
-        <w:color w:val="FFFFFF" w:themeColor="background1"/>
+        <w:color w:val="000000"/>
       </w:rPr>
       <w:tblPr/>
       <w:tcPr>
@@ -14405,7 +14522,7 @@
       <w:spacing w:after="0" w:line="240" w:lineRule="auto"/>
     </w:pPr>
     <w:rPr>
-      <w:color w:val="000000" w:themeColor="text1"/>
+      <w:color w:val="000000"/>
     </w:rPr>
     <w:tblPr>
       <w:tblStyleRowBandSize w:val="1"/>
@@ -14438,7 +14555,7 @@
       <w:rPr>
         <w:b/>
         <w:bCs/>
-        <w:color w:val="000000" w:themeColor="text1"/>
+        <w:color w:val="000000"/>
       </w:rPr>
       <w:tblPr/>
       <w:tcPr>
@@ -14447,7 +14564,7 @@
     </w:tblStylePr>
     <w:tblStylePr w:type="firstCol">
       <w:rPr>
-        <w:color w:val="FFFFFF" w:themeColor="background1"/>
+        <w:color w:val="000000"/>
       </w:rPr>
       <w:tblPr/>
       <w:tcPr>
@@ -14456,7 +14573,7 @@
     </w:tblStylePr>
     <w:tblStylePr w:type="lastCol">
       <w:rPr>
-        <w:color w:val="FFFFFF" w:themeColor="background1"/>
+        <w:color w:val="000000"/>
       </w:rPr>
       <w:tblPr/>
       <w:tcPr>
@@ -14485,7 +14602,7 @@
       <w:spacing w:after="0" w:line="240" w:lineRule="auto"/>
     </w:pPr>
     <w:rPr>
-      <w:color w:val="000000" w:themeColor="text1"/>
+      <w:color w:val="000000"/>
     </w:rPr>
     <w:tblPr>
       <w:tblStyleRowBandSize w:val="1"/>
@@ -14518,7 +14635,7 @@
       <w:rPr>
         <w:b/>
         <w:bCs/>
-        <w:color w:val="000000" w:themeColor="text1"/>
+        <w:color w:val="000000"/>
       </w:rPr>
       <w:tblPr/>
       <w:tcPr>
@@ -14527,7 +14644,7 @@
     </w:tblStylePr>
     <w:tblStylePr w:type="firstCol">
       <w:rPr>
-        <w:color w:val="FFFFFF" w:themeColor="background1"/>
+        <w:color w:val="000000"/>
       </w:rPr>
       <w:tblPr/>
       <w:tcPr>
@@ -14536,7 +14653,7 @@
     </w:tblStylePr>
     <w:tblStylePr w:type="lastCol">
       <w:rPr>
-        <w:color w:val="FFFFFF" w:themeColor="background1"/>
+        <w:color w:val="000000"/>
       </w:rPr>
       <w:tblPr/>
       <w:tcPr>
@@ -14565,7 +14682,7 @@
       <w:spacing w:after="0" w:line="240" w:lineRule="auto"/>
     </w:pPr>
     <w:rPr>
-      <w:color w:val="000000" w:themeColor="text1"/>
+      <w:color w:val="000000"/>
     </w:rPr>
     <w:tblPr>
       <w:tblStyleRowBandSize w:val="1"/>
@@ -14598,7 +14715,7 @@
       <w:rPr>
         <w:b/>
         <w:bCs/>
-        <w:color w:val="000000" w:themeColor="text1"/>
+        <w:color w:val="000000"/>
       </w:rPr>
       <w:tblPr/>
       <w:tcPr>
@@ -14607,7 +14724,7 @@
     </w:tblStylePr>
     <w:tblStylePr w:type="firstCol">
       <w:rPr>
-        <w:color w:val="FFFFFF" w:themeColor="background1"/>
+        <w:color w:val="000000"/>
       </w:rPr>
       <w:tblPr/>
       <w:tcPr>
@@ -14616,7 +14733,7 @@
     </w:tblStylePr>
     <w:tblStylePr w:type="lastCol">
       <w:rPr>
-        <w:color w:val="FFFFFF" w:themeColor="background1"/>
+        <w:color w:val="000000"/>
       </w:rPr>
       <w:tblPr/>
       <w:tcPr>
@@ -14645,7 +14762,7 @@
       <w:spacing w:after="0" w:line="240" w:lineRule="auto"/>
     </w:pPr>
     <w:rPr>
-      <w:color w:val="000000" w:themeColor="text1"/>
+      <w:color w:val="000000"/>
     </w:rPr>
     <w:tblPr>
       <w:tblStyleRowBandSize w:val="1"/>
@@ -14678,7 +14795,7 @@
       <w:rPr>
         <w:b/>
         <w:bCs/>
-        <w:color w:val="000000" w:themeColor="text1"/>
+        <w:color w:val="000000"/>
       </w:rPr>
       <w:tblPr/>
       <w:tcPr>
@@ -14687,7 +14804,7 @@
     </w:tblStylePr>
     <w:tblStylePr w:type="firstCol">
       <w:rPr>
-        <w:color w:val="FFFFFF" w:themeColor="background1"/>
+        <w:color w:val="000000"/>
       </w:rPr>
       <w:tblPr/>
       <w:tcPr>
@@ -14696,7 +14813,7 @@
     </w:tblStylePr>
     <w:tblStylePr w:type="lastCol">
       <w:rPr>
-        <w:color w:val="FFFFFF" w:themeColor="background1"/>
+        <w:color w:val="000000"/>
       </w:rPr>
       <w:tblPr/>
       <w:tcPr>
@@ -14725,7 +14842,7 @@
       <w:spacing w:after="0" w:line="240" w:lineRule="auto"/>
     </w:pPr>
     <w:rPr>
-      <w:color w:val="000000" w:themeColor="text1"/>
+      <w:color w:val="000000"/>
     </w:rPr>
     <w:tblPr>
       <w:tblStyleRowBandSize w:val="1"/>
@@ -14758,7 +14875,7 @@
       <w:rPr>
         <w:b/>
         <w:bCs/>
-        <w:color w:val="000000" w:themeColor="text1"/>
+        <w:color w:val="000000"/>
       </w:rPr>
       <w:tblPr/>
       <w:tcPr>
@@ -14767,7 +14884,7 @@
     </w:tblStylePr>
     <w:tblStylePr w:type="firstCol">
       <w:rPr>
-        <w:color w:val="FFFFFF" w:themeColor="background1"/>
+        <w:color w:val="000000"/>
       </w:rPr>
       <w:tblPr/>
       <w:tcPr>
@@ -14776,7 +14893,7 @@
     </w:tblStylePr>
     <w:tblStylePr w:type="lastCol">
       <w:rPr>
-        <w:color w:val="FFFFFF" w:themeColor="background1"/>
+        <w:color w:val="000000"/>
       </w:rPr>
       <w:tblPr/>
       <w:tcPr>
@@ -14805,7 +14922,7 @@
       <w:spacing w:after="0" w:line="240" w:lineRule="auto"/>
     </w:pPr>
     <w:rPr>
-      <w:color w:val="000000" w:themeColor="text1"/>
+      <w:color w:val="000000"/>
     </w:rPr>
     <w:tblPr>
       <w:tblStyleRowBandSize w:val="1"/>
@@ -14838,7 +14955,7 @@
       <w:rPr>
         <w:b/>
         <w:bCs/>
-        <w:color w:val="000000" w:themeColor="text1"/>
+        <w:color w:val="000000"/>
       </w:rPr>
       <w:tblPr/>
       <w:tcPr>
@@ -14847,7 +14964,7 @@
     </w:tblStylePr>
     <w:tblStylePr w:type="firstCol">
       <w:rPr>
-        <w:color w:val="FFFFFF" w:themeColor="background1"/>
+        <w:color w:val="000000"/>
       </w:rPr>
       <w:tblPr/>
       <w:tcPr>
@@ -14856,7 +14973,7 @@
     </w:tblStylePr>
     <w:tblStylePr w:type="lastCol">
       <w:rPr>
-        <w:color w:val="FFFFFF" w:themeColor="background1"/>
+        <w:color w:val="000000"/>
       </w:rPr>
       <w:tblPr/>
       <w:tcPr>

</xml_diff>